<commit_message>
Edits to SBR case study
</commit_message>
<xml_diff>
--- a/NHP Report Template_SBR_casestudy.docx
+++ b/NHP Report Template_SBR_casestudy.docx
@@ -102,7 +102,6 @@
                                     <w:calendar w:val="gregorian"/>
                                   </w:date>
                                 </w:sdtPr>
-                                <w:sdtEndPr/>
                                 <w:sdtContent>
                                   <w:p>
                                     <w:pPr>
@@ -962,7 +961,6 @@
                                 <w:dataBinding w:prefixMappings="xmlns:ns0='http://schemas.openxmlformats.org/officeDocument/2006/extended-properties' " w:xpath="/ns0:Properties[1]/ns0:Company[1]" w:storeItemID="{6668398D-A668-4E3E-A5EB-62B293D839F1}"/>
                                 <w:text/>
                               </w:sdtPr>
-                              <w:sdtEndPr/>
                               <w:sdtContent>
                                 <w:r>
                                   <w:rPr>
@@ -1009,7 +1007,6 @@
                                 <w:dataBinding w:prefixMappings="xmlns:ns0='http://schemas.microsoft.com/office/2006/coverPageProps' " w:xpath="/ns0:CoverPageProperties[1]/ns0:CompanyAddress[1]" w:storeItemID="{55AF091B-3C7A-41E3-B477-F2FDAA23CFDA}"/>
                                 <w:text/>
                               </w:sdtPr>
-                              <w:sdtEndPr/>
                               <w:sdtContent>
                                 <w:r>
                                   <w:rPr>
@@ -1215,7 +1212,6 @@
                               <w:dataBinding w:prefixMappings="xmlns:ns0='http://purl.org/dc/elements/1.1/' xmlns:ns1='http://schemas.openxmlformats.org/package/2006/metadata/core-properties' " w:xpath="/ns1:coreProperties[1]/ns0:subject[1]" w:storeItemID="{6C3C8BC8-F283-45AE-878A-BAB7291924A1}"/>
                               <w:text/>
                             </w:sdtPr>
-                            <w:sdtEndPr/>
                             <w:sdtContent>
                               <w:p>
                                 <w:pPr>
@@ -1279,7 +1275,6 @@
                               <w:dataBinding w:prefixMappings="xmlns:ns0='http://purl.org/dc/elements/1.1/' xmlns:ns1='http://schemas.openxmlformats.org/package/2006/metadata/core-properties' " w:xpath="/ns1:coreProperties[1]/ns0:creator[1]" w:storeItemID="{6C3C8BC8-F283-45AE-878A-BAB7291924A1}"/>
                               <w:text/>
                             </w:sdtPr>
-                            <w:sdtEndPr/>
                             <w:sdtContent>
                               <w:p>
                                 <w:pPr>
@@ -1613,55 +1608,7 @@
           <w:sz w:val="24"/>
           <w:szCs w:val="24"/>
         </w:rPr>
-        <w:t xml:space="preserve">Whilst there is a range of evidence that identifies potential impacts on patients, staff and hospital productivity of </w:t>
-      </w:r>
-      <w:r>
-        <w:rPr>
-          <w:rFonts w:ascii="Arial" w:hAnsi="Arial" w:cs="Arial"/>
-          <w:sz w:val="24"/>
-          <w:szCs w:val="24"/>
-        </w:rPr>
-        <w:t>single-bed room</w:t>
-      </w:r>
-      <w:r>
-        <w:rPr>
-          <w:rFonts w:ascii="Arial" w:hAnsi="Arial" w:cs="Arial"/>
-          <w:sz w:val="24"/>
-          <w:szCs w:val="24"/>
-        </w:rPr>
-        <w:t>s</w:t>
-      </w:r>
-      <w:r>
-        <w:rPr>
-          <w:rFonts w:ascii="Arial" w:hAnsi="Arial" w:cs="Arial"/>
-          <w:sz w:val="24"/>
-          <w:szCs w:val="24"/>
-        </w:rPr>
-        <w:t xml:space="preserve"> (SBR)</w:t>
-      </w:r>
-      <w:r>
-        <w:rPr>
-          <w:rFonts w:ascii="Arial" w:hAnsi="Arial" w:cs="Arial"/>
-          <w:sz w:val="24"/>
-          <w:szCs w:val="24"/>
-        </w:rPr>
-        <w:t>,</w:t>
-      </w:r>
-      <w:r>
-        <w:rPr>
-          <w:rFonts w:ascii="Arial" w:hAnsi="Arial" w:cs="Arial"/>
-          <w:sz w:val="24"/>
-          <w:szCs w:val="24"/>
-        </w:rPr>
-        <w:t xml:space="preserve"> </w:t>
-      </w:r>
-      <w:r>
-        <w:rPr>
-          <w:rFonts w:ascii="Arial" w:hAnsi="Arial" w:cs="Arial"/>
-          <w:sz w:val="24"/>
-          <w:szCs w:val="24"/>
-        </w:rPr>
-        <w:t>there are limited quantitative studies using examples from England.</w:t>
+        <w:t>Whilst there is a range of evidence that identifies potential impacts on patients, staff and hospital productivity of single-bed rooms (SBR), there are limited quantitative studies using examples from England.</w:t>
       </w:r>
     </w:p>
     <w:p>
@@ -1678,55 +1625,115 @@
           <w:sz w:val="24"/>
           <w:szCs w:val="24"/>
         </w:rPr>
-        <w:t>This study of the impacts of switching hospital inpatient beds from multi to SBR accommodation</w:t>
-      </w:r>
-      <w:r>
-        <w:rPr>
-          <w:rFonts w:ascii="Arial" w:hAnsi="Arial" w:cs="Arial"/>
-          <w:sz w:val="24"/>
-          <w:szCs w:val="24"/>
-        </w:rPr>
-        <w:t xml:space="preserve">, therefore, </w:t>
-      </w:r>
-      <w:r>
-        <w:rPr>
-          <w:rFonts w:ascii="Arial" w:hAnsi="Arial" w:cs="Arial"/>
-          <w:sz w:val="24"/>
-          <w:szCs w:val="24"/>
-        </w:rPr>
-        <w:t xml:space="preserve">aims to add additional insight to the </w:t>
-      </w:r>
-      <w:r>
-        <w:rPr>
-          <w:rFonts w:ascii="Arial" w:hAnsi="Arial" w:cs="Arial"/>
-          <w:sz w:val="24"/>
-          <w:szCs w:val="24"/>
-        </w:rPr>
-        <w:t xml:space="preserve">underpinning </w:t>
-      </w:r>
-      <w:r>
-        <w:rPr>
-          <w:rFonts w:ascii="Arial" w:hAnsi="Arial" w:cs="Arial"/>
-          <w:sz w:val="24"/>
-          <w:szCs w:val="24"/>
-        </w:rPr>
-        <w:t>assumptions of the NHP programme around SBR</w:t>
-      </w:r>
-      <w:r>
-        <w:rPr>
-          <w:rFonts w:ascii="Arial" w:hAnsi="Arial" w:cs="Arial"/>
-          <w:sz w:val="24"/>
-          <w:szCs w:val="24"/>
-        </w:rPr>
-        <w:t xml:space="preserve"> using both published and routine hospital data</w:t>
-      </w:r>
-      <w:r>
-        <w:rPr>
-          <w:rFonts w:ascii="Arial" w:hAnsi="Arial" w:cs="Arial"/>
-          <w:sz w:val="24"/>
-          <w:szCs w:val="24"/>
-        </w:rPr>
-        <w:t>.</w:t>
+        <w:t xml:space="preserve">Literature reviews have found mixed evidence on the impacts of single room hospitals, although one did conclude single room hospitals appear to have more advantages than disadvantages Bertuzzi </w:t>
+      </w:r>
+      <w:r>
+        <w:rPr>
+          <w:rFonts w:ascii="Arial" w:hAnsi="Arial" w:cs="Arial"/>
+          <w:i/>
+          <w:iCs/>
+          <w:sz w:val="24"/>
+          <w:szCs w:val="24"/>
+        </w:rPr>
+        <w:t>et al</w:t>
+      </w:r>
+      <w:r>
+        <w:rPr>
+          <w:rFonts w:ascii="Arial" w:hAnsi="Arial" w:cs="Arial"/>
+          <w:sz w:val="24"/>
+          <w:szCs w:val="24"/>
+        </w:rPr>
+        <w:t xml:space="preserve">., 2023; Taylor </w:t>
+      </w:r>
+      <w:r>
+        <w:rPr>
+          <w:rFonts w:ascii="Arial" w:hAnsi="Arial" w:cs="Arial"/>
+          <w:i/>
+          <w:iCs/>
+          <w:sz w:val="24"/>
+          <w:szCs w:val="24"/>
+        </w:rPr>
+        <w:t>et al</w:t>
+      </w:r>
+      <w:r>
+        <w:rPr>
+          <w:rFonts w:ascii="Arial" w:hAnsi="Arial" w:cs="Arial"/>
+          <w:sz w:val="24"/>
+          <w:szCs w:val="24"/>
+        </w:rPr>
+        <w:t xml:space="preserve">., 2018; van de </w:t>
+      </w:r>
+      <w:proofErr w:type="spellStart"/>
+      <w:r>
+        <w:rPr>
+          <w:rFonts w:ascii="Arial" w:hAnsi="Arial" w:cs="Arial"/>
+          <w:sz w:val="24"/>
+          <w:szCs w:val="24"/>
+        </w:rPr>
+        <w:t>Glind</w:t>
+      </w:r>
+      <w:proofErr w:type="spellEnd"/>
+      <w:r>
+        <w:rPr>
+          <w:rFonts w:ascii="Arial" w:hAnsi="Arial" w:cs="Arial"/>
+          <w:sz w:val="24"/>
+          <w:szCs w:val="24"/>
+        </w:rPr>
+        <w:t xml:space="preserve"> </w:t>
+      </w:r>
+      <w:r>
+        <w:rPr>
+          <w:rFonts w:ascii="Arial" w:hAnsi="Arial" w:cs="Arial"/>
+          <w:i/>
+          <w:iCs/>
+          <w:sz w:val="24"/>
+          <w:szCs w:val="24"/>
+        </w:rPr>
+        <w:t>et al</w:t>
+      </w:r>
+      <w:r>
+        <w:rPr>
+          <w:rFonts w:ascii="Arial" w:hAnsi="Arial" w:cs="Arial"/>
+          <w:sz w:val="24"/>
+          <w:szCs w:val="24"/>
+        </w:rPr>
+        <w:t xml:space="preserve">., 2007; Voigt </w:t>
+      </w:r>
+      <w:r>
+        <w:rPr>
+          <w:rFonts w:ascii="Arial" w:hAnsi="Arial" w:cs="Arial"/>
+          <w:i/>
+          <w:iCs/>
+          <w:sz w:val="24"/>
+          <w:szCs w:val="24"/>
+        </w:rPr>
+        <w:t>et al</w:t>
+      </w:r>
+      <w:r>
+        <w:rPr>
+          <w:rFonts w:ascii="Arial" w:hAnsi="Arial" w:cs="Arial"/>
+          <w:sz w:val="24"/>
+          <w:szCs w:val="24"/>
+        </w:rPr>
+        <w:t xml:space="preserve">., 2018). A recent systematic review suggested any clinical or economic benefits are likely to be small in routine care, but that benefits would be more likely to be seen in intensive care (Bertuzzi </w:t>
+      </w:r>
+      <w:r>
+        <w:rPr>
+          <w:rFonts w:ascii="Arial" w:hAnsi="Arial" w:cs="Arial"/>
+          <w:i/>
+          <w:iCs/>
+          <w:sz w:val="24"/>
+          <w:szCs w:val="24"/>
+        </w:rPr>
+        <w:t>et al</w:t>
+      </w:r>
+      <w:r>
+        <w:rPr>
+          <w:rFonts w:ascii="Arial" w:hAnsi="Arial" w:cs="Arial"/>
+          <w:sz w:val="24"/>
+          <w:szCs w:val="24"/>
+        </w:rPr>
+        <w:t>., 2023).</w:t>
       </w:r>
     </w:p>
     <w:p>
@@ -1743,31 +1750,7 @@
           <w:sz w:val="24"/>
           <w:szCs w:val="24"/>
         </w:rPr>
-        <w:t xml:space="preserve">The aim </w:t>
-      </w:r>
-      <w:r>
-        <w:rPr>
-          <w:rFonts w:ascii="Arial" w:hAnsi="Arial" w:cs="Arial"/>
-          <w:sz w:val="24"/>
-          <w:szCs w:val="24"/>
-        </w:rPr>
-        <w:t>was</w:t>
-      </w:r>
-      <w:r>
-        <w:rPr>
-          <w:rFonts w:ascii="Arial" w:hAnsi="Arial" w:cs="Arial"/>
-          <w:sz w:val="24"/>
-          <w:szCs w:val="24"/>
-        </w:rPr>
-        <w:t xml:space="preserve"> to evaluate the direction and scale of impacts on a range of metrics after hospitals switched to SBR.</w:t>
-      </w:r>
-      <w:r>
-        <w:rPr>
-          <w:rFonts w:ascii="Arial" w:hAnsi="Arial" w:cs="Arial"/>
-          <w:sz w:val="24"/>
-          <w:szCs w:val="24"/>
-        </w:rPr>
-        <w:t xml:space="preserve"> In order to do so we identified 7 hospital sites acting as ‘natural experiments’ across England between 2010 and 2022.</w:t>
+        <w:t>This study of the impacts of switching hospital inpatient beds from multi to SBR accommodation, therefore, aims to add additional insight to the underpinning assumptions of the NHP programme around SBR using both published and routine hospital data.</w:t>
       </w:r>
     </w:p>
     <w:p>
@@ -1778,9 +1761,60 @@
           <w:szCs w:val="24"/>
         </w:rPr>
       </w:pPr>
+      <w:r>
+        <w:rPr>
+          <w:rFonts w:ascii="Arial" w:hAnsi="Arial" w:cs="Arial"/>
+          <w:sz w:val="24"/>
+          <w:szCs w:val="24"/>
+        </w:rPr>
+        <w:t xml:space="preserve">The aim </w:t>
+      </w:r>
+      <w:r>
+        <w:rPr>
+          <w:rFonts w:ascii="Arial" w:hAnsi="Arial" w:cs="Arial"/>
+          <w:sz w:val="24"/>
+          <w:szCs w:val="24"/>
+        </w:rPr>
+        <w:t>was</w:t>
+      </w:r>
+      <w:r>
+        <w:rPr>
+          <w:rFonts w:ascii="Arial" w:hAnsi="Arial" w:cs="Arial"/>
+          <w:sz w:val="24"/>
+          <w:szCs w:val="24"/>
+        </w:rPr>
+        <w:t xml:space="preserve"> to evaluate the direction and scale of impacts on a range of metrics after hospitals switched to SBR.</w:t>
+      </w:r>
+      <w:r>
+        <w:rPr>
+          <w:rFonts w:ascii="Arial" w:hAnsi="Arial" w:cs="Arial"/>
+          <w:sz w:val="24"/>
+          <w:szCs w:val="24"/>
+        </w:rPr>
+        <w:t xml:space="preserve"> </w:t>
+      </w:r>
+      <w:proofErr w:type="gramStart"/>
+      <w:r>
+        <w:rPr>
+          <w:rFonts w:ascii="Arial" w:hAnsi="Arial" w:cs="Arial"/>
+          <w:sz w:val="24"/>
+          <w:szCs w:val="24"/>
+        </w:rPr>
+        <w:t>In order to</w:t>
+      </w:r>
+      <w:proofErr w:type="gramEnd"/>
+      <w:r>
+        <w:rPr>
+          <w:rFonts w:ascii="Arial" w:hAnsi="Arial" w:cs="Arial"/>
+          <w:sz w:val="24"/>
+          <w:szCs w:val="24"/>
+        </w:rPr>
+        <w:t xml:space="preserve"> do so we identified 7 hospital sites acting as ‘natural experiments’ across England between 2010 and 2022.</w:t>
+      </w:r>
     </w:p>
     <w:p>
       <w:pPr>
+        <w:spacing w:before="360" w:after="0"/>
         <w:rPr>
           <w:rFonts w:ascii="Arial" w:hAnsi="Arial" w:cs="Arial"/>
           <w:b/>
@@ -1802,28 +1836,15 @@
     </w:p>
     <w:p>
       <w:pPr>
-        <w:rPr>
-          <w:rFonts w:ascii="Arial" w:hAnsi="Arial" w:cs="Arial"/>
-          <w:sz w:val="24"/>
-          <w:szCs w:val="24"/>
-        </w:rPr>
-      </w:pPr>
-      <w:r>
-        <w:rPr>
-          <w:rFonts w:ascii="Arial" w:hAnsi="Arial" w:cs="Arial"/>
-          <w:sz w:val="24"/>
-          <w:szCs w:val="24"/>
-        </w:rPr>
-        <w:t>Existing evidence (references…HEU, NHP living review?) pointed towards material impacts on patient and staff experience of care/caring, on health and safety and on hospital costs and productivity.</w:t>
-      </w:r>
-      <w:r>
-        <w:rPr>
-          <w:rFonts w:ascii="Arial" w:hAnsi="Arial" w:cs="Arial"/>
-          <w:sz w:val="24"/>
-          <w:szCs w:val="24"/>
-        </w:rPr>
-        <w:br/>
-      </w:r>
+        <w:spacing w:after="240"/>
+        <w:rPr>
+          <w:rFonts w:ascii="Arial" w:hAnsi="Arial" w:cs="Arial"/>
+          <w:b/>
+          <w:bCs/>
+          <w:sz w:val="24"/>
+          <w:szCs w:val="24"/>
+        </w:rPr>
+      </w:pPr>
       <w:r>
         <w:rPr>
           <w:rFonts w:ascii="Arial" w:hAnsi="Arial" w:cs="Arial"/>
@@ -1925,13 +1946,35 @@
           <w:sz w:val="24"/>
           <w:szCs w:val="24"/>
         </w:rPr>
-        <w:t>Figure 1. Final set of impact measures evaluated in the study</w:t>
+        <w:br w:type="page"/>
       </w:r>
     </w:p>
     <w:p>
       <w:pPr>
         <w:rPr>
           <w:rFonts w:ascii="Arial" w:hAnsi="Arial" w:cs="Arial"/>
+          <w:i/>
+          <w:iCs/>
+          <w:sz w:val="24"/>
+          <w:szCs w:val="24"/>
+        </w:rPr>
+      </w:pPr>
+      <w:r>
+        <w:rPr>
+          <w:rFonts w:ascii="Arial" w:hAnsi="Arial" w:cs="Arial"/>
+          <w:i/>
+          <w:iCs/>
+          <w:sz w:val="24"/>
+          <w:szCs w:val="24"/>
+        </w:rPr>
+        <w:lastRenderedPageBreak/>
+        <w:t>Figure 1. Final set of impact measures evaluated in the study</w:t>
+      </w:r>
+    </w:p>
+    <w:p>
+      <w:pPr>
+        <w:rPr>
+          <w:rFonts w:ascii="Arial" w:hAnsi="Arial" w:cs="Arial"/>
           <w:sz w:val="24"/>
           <w:szCs w:val="24"/>
         </w:rPr>
@@ -1944,7 +1987,6 @@
           <w:szCs w:val="24"/>
           <w14:ligatures w14:val="none"/>
         </w:rPr>
-        <w:lastRenderedPageBreak/>
         <w:drawing>
           <wp:inline distT="0" distB="0" distL="0" distR="0" wp14:anchorId="46C11059" wp14:editId="1F7CB428">
             <wp:extent cx="6645910" cy="2207260"/>
@@ -2002,7 +2044,23 @@
           <w:sz w:val="24"/>
           <w:szCs w:val="24"/>
         </w:rPr>
-        <w:t xml:space="preserve">We used Causal Impact Analysis (CIA, reference…?) to quantify the post-SBR changes compared to a pre-SBR projection for each measure and each hospital. The counterfactual </w:t>
+        <w:t xml:space="preserve">We used Causal Impact Analysis (CIA, </w:t>
+      </w:r>
+      <w:r>
+        <w:rPr>
+          <w:rFonts w:ascii="Arial" w:hAnsi="Arial" w:cs="Arial"/>
+          <w:sz w:val="24"/>
+          <w:szCs w:val="24"/>
+        </w:rPr>
+        <w:t>Broderson et al., 2015</w:t>
+      </w:r>
+      <w:r>
+        <w:rPr>
+          <w:rFonts w:ascii="Arial" w:hAnsi="Arial" w:cs="Arial"/>
+          <w:sz w:val="24"/>
+          <w:szCs w:val="24"/>
+        </w:rPr>
+        <w:t xml:space="preserve">) to quantify the post-SBR changes compared to a pre-SBR projection for each measure and each hospital. The counterfactual </w:t>
       </w:r>
       <w:r>
         <w:rPr>
@@ -2042,6 +2100,145 @@
       <w:pPr>
         <w:rPr>
           <w:rFonts w:ascii="Arial" w:hAnsi="Arial" w:cs="Arial"/>
+          <w:i/>
+          <w:iCs/>
+          <w:sz w:val="24"/>
+          <w:szCs w:val="24"/>
+        </w:rPr>
+      </w:pPr>
+      <w:r>
+        <w:rPr>
+          <w:rFonts w:ascii="Arial" w:hAnsi="Arial" w:cs="Arial"/>
+          <w:i/>
+          <w:iCs/>
+          <w:sz w:val="24"/>
+          <w:szCs w:val="24"/>
+        </w:rPr>
+        <w:t xml:space="preserve">Figure </w:t>
+      </w:r>
+      <w:r>
+        <w:rPr>
+          <w:rFonts w:ascii="Arial" w:hAnsi="Arial" w:cs="Arial"/>
+          <w:i/>
+          <w:iCs/>
+          <w:sz w:val="24"/>
+          <w:szCs w:val="24"/>
+        </w:rPr>
+        <w:t>2</w:t>
+      </w:r>
+      <w:r>
+        <w:rPr>
+          <w:rFonts w:ascii="Arial" w:hAnsi="Arial" w:cs="Arial"/>
+          <w:i/>
+          <w:iCs/>
+          <w:sz w:val="24"/>
+          <w:szCs w:val="24"/>
+        </w:rPr>
+        <w:t>. Example of</w:t>
+      </w:r>
+      <w:r>
+        <w:rPr>
+          <w:rFonts w:ascii="Arial" w:hAnsi="Arial" w:cs="Arial"/>
+          <w:i/>
+          <w:iCs/>
+          <w:sz w:val="24"/>
+          <w:szCs w:val="24"/>
+        </w:rPr>
+        <w:t xml:space="preserve"> causal impact analysis on mean length of stay at </w:t>
+      </w:r>
+      <w:r>
+        <w:rPr>
+          <w:rFonts w:ascii="Arial" w:hAnsi="Arial" w:cs="Arial"/>
+          <w:i/>
+          <w:iCs/>
+          <w:sz w:val="24"/>
+          <w:szCs w:val="24"/>
+        </w:rPr>
+        <w:t>hospital x</w:t>
+      </w:r>
+      <w:r>
+        <w:rPr>
+          <w:rFonts w:ascii="Arial" w:hAnsi="Arial" w:cs="Arial"/>
+          <w:i/>
+          <w:iCs/>
+          <w:sz w:val="24"/>
+          <w:szCs w:val="24"/>
+        </w:rPr>
+        <w:t>.</w:t>
+      </w:r>
+    </w:p>
+    <w:p>
+      <w:pPr>
+        <w:rPr>
+          <w:rFonts w:ascii="Arial" w:hAnsi="Arial" w:cs="Arial"/>
+          <w:sz w:val="24"/>
+          <w:szCs w:val="24"/>
+        </w:rPr>
+      </w:pPr>
+      <w:r>
+        <w:rPr>
+          <w:rFonts w:ascii="Arial" w:hAnsi="Arial" w:cs="Arial"/>
+          <w:noProof/>
+          <w:sz w:val="24"/>
+          <w:szCs w:val="24"/>
+        </w:rPr>
+        <w:drawing>
+          <wp:inline distT="0" distB="0" distL="0" distR="0" wp14:anchorId="4879BCBC" wp14:editId="1DBEDD8D">
+            <wp:extent cx="2923898" cy="2026920"/>
+            <wp:effectExtent l="0" t="0" r="0" b="0"/>
+            <wp:docPr id="1073857775" name="Picture 9" descr="A graph of different types of lines&#10;&#10;Description automatically generated with medium confidence"/>
+            <wp:cNvGraphicFramePr>
+              <a:graphicFrameLocks xmlns:a="http://schemas.openxmlformats.org/drawingml/2006/main" noChangeAspect="1"/>
+            </wp:cNvGraphicFramePr>
+            <a:graphic xmlns:a="http://schemas.openxmlformats.org/drawingml/2006/main">
+              <a:graphicData uri="http://schemas.openxmlformats.org/drawingml/2006/picture">
+                <pic:pic xmlns:pic="http://schemas.openxmlformats.org/drawingml/2006/picture">
+                  <pic:nvPicPr>
+                    <pic:cNvPr id="1073857775" name="Picture 9" descr="A graph of different types of lines&#10;&#10;Description automatically generated with medium confidence"/>
+                    <pic:cNvPicPr>
+                      <a:picLocks noChangeAspect="1" noChangeArrowheads="1"/>
+                    </pic:cNvPicPr>
+                  </pic:nvPicPr>
+                  <pic:blipFill rotWithShape="1">
+                    <a:blip r:embed="rId14" cstate="print">
+                      <a:extLst>
+                        <a:ext uri="{28A0092B-C50C-407E-A947-70E740481C1C}">
+                          <a14:useLocalDpi xmlns:a14="http://schemas.microsoft.com/office/drawing/2010/main" val="0"/>
+                        </a:ext>
+                      </a:extLst>
+                    </a:blip>
+                    <a:srcRect b="33693"/>
+                    <a:stretch/>
+                  </pic:blipFill>
+                  <pic:spPr bwMode="auto">
+                    <a:xfrm>
+                      <a:off x="0" y="0"/>
+                      <a:ext cx="2927777" cy="2029609"/>
+                    </a:xfrm>
+                    <a:prstGeom prst="rect">
+                      <a:avLst/>
+                    </a:prstGeom>
+                    <a:noFill/>
+                    <a:ln>
+                      <a:noFill/>
+                    </a:ln>
+                    <a:extLst>
+                      <a:ext uri="{53640926-AAD7-44D8-BBD7-CCE9431645EC}">
+                        <a14:shadowObscured xmlns:a14="http://schemas.microsoft.com/office/drawing/2010/main"/>
+                      </a:ext>
+                    </a:extLst>
+                  </pic:spPr>
+                </pic:pic>
+              </a:graphicData>
+            </a:graphic>
+          </wp:inline>
+        </w:drawing>
+      </w:r>
+    </w:p>
+    <w:p>
+      <w:pPr>
+        <w:rPr>
+          <w:rFonts w:ascii="Arial" w:hAnsi="Arial" w:cs="Arial"/>
           <w:b/>
           <w:bCs/>
           <w:sz w:val="24"/>
@@ -2073,115 +2270,68 @@
           <w:sz w:val="24"/>
           <w:szCs w:val="24"/>
         </w:rPr>
-        <w:t xml:space="preserve">The analysis highlighted </w:t>
-      </w:r>
-      <w:r>
-        <w:rPr>
-          <w:rFonts w:ascii="Arial" w:hAnsi="Arial" w:cs="Arial"/>
-          <w:sz w:val="24"/>
-          <w:szCs w:val="24"/>
-        </w:rPr>
-        <w:t xml:space="preserve">potential </w:t>
-      </w:r>
-      <w:r>
-        <w:rPr>
-          <w:rFonts w:ascii="Arial" w:hAnsi="Arial" w:cs="Arial"/>
-          <w:sz w:val="24"/>
-          <w:szCs w:val="24"/>
-        </w:rPr>
-        <w:t xml:space="preserve">significant </w:t>
-      </w:r>
-      <w:r>
-        <w:rPr>
-          <w:rFonts w:ascii="Arial" w:hAnsi="Arial" w:cs="Arial"/>
-          <w:sz w:val="24"/>
-          <w:szCs w:val="24"/>
-        </w:rPr>
-        <w:t>negative</w:t>
-      </w:r>
-      <w:r>
-        <w:rPr>
-          <w:rFonts w:ascii="Arial" w:hAnsi="Arial" w:cs="Arial"/>
-          <w:sz w:val="24"/>
-          <w:szCs w:val="24"/>
-        </w:rPr>
-        <w:t xml:space="preserve"> impacts for </w:t>
-      </w:r>
-      <w:r>
-        <w:rPr>
-          <w:rFonts w:ascii="Arial" w:hAnsi="Arial" w:cs="Arial"/>
-          <w:sz w:val="24"/>
-          <w:szCs w:val="24"/>
-        </w:rPr>
-        <w:t xml:space="preserve">staff wellbeing </w:t>
-      </w:r>
-      <w:r>
-        <w:rPr>
-          <w:rFonts w:ascii="Arial" w:hAnsi="Arial" w:cs="Arial"/>
-          <w:sz w:val="24"/>
-          <w:szCs w:val="24"/>
-        </w:rPr>
-        <w:t>with</w:t>
-      </w:r>
-      <w:r>
-        <w:rPr>
-          <w:rFonts w:ascii="Arial" w:hAnsi="Arial" w:cs="Arial"/>
-          <w:sz w:val="24"/>
-          <w:szCs w:val="24"/>
-        </w:rPr>
-        <w:t xml:space="preserve"> a </w:t>
-      </w:r>
-      <w:r>
-        <w:rPr>
-          <w:rFonts w:ascii="Arial" w:hAnsi="Arial" w:cs="Arial"/>
-          <w:sz w:val="24"/>
-          <w:szCs w:val="24"/>
-        </w:rPr>
-        <w:t>range</w:t>
-      </w:r>
-      <w:r>
-        <w:rPr>
-          <w:rFonts w:ascii="Arial" w:hAnsi="Arial" w:cs="Arial"/>
-          <w:sz w:val="24"/>
-          <w:szCs w:val="24"/>
-        </w:rPr>
-        <w:t xml:space="preserve"> of</w:t>
-      </w:r>
-      <w:r>
-        <w:rPr>
-          <w:rFonts w:ascii="Arial" w:hAnsi="Arial" w:cs="Arial"/>
-          <w:sz w:val="24"/>
-          <w:szCs w:val="24"/>
-        </w:rPr>
-        <w:t xml:space="preserve"> non-significant positive </w:t>
-      </w:r>
-      <w:r>
-        <w:rPr>
-          <w:rFonts w:ascii="Arial" w:hAnsi="Arial" w:cs="Arial"/>
-          <w:sz w:val="24"/>
-          <w:szCs w:val="24"/>
-        </w:rPr>
-        <w:t>impacts</w:t>
-      </w:r>
-      <w:r>
-        <w:rPr>
-          <w:rFonts w:ascii="Arial" w:hAnsi="Arial" w:cs="Arial"/>
-          <w:sz w:val="24"/>
-          <w:szCs w:val="24"/>
-        </w:rPr>
-        <w:t xml:space="preserve"> including length of stay, readmissions and HCAI (clostridium difficile).</w:t>
+        <w:t xml:space="preserve">The impact of switching to single occupancy rooms in hospital is highly variable both within indicator measures and between hospitals. We find no evidence to support a significant increase in productivity or efficiency in single room hospitals. We also find </w:t>
+      </w:r>
+      <w:r>
+        <w:rPr>
+          <w:rFonts w:ascii="Arial" w:hAnsi="Arial" w:cs="Arial"/>
+          <w:sz w:val="24"/>
+          <w:szCs w:val="24"/>
+        </w:rPr>
+        <w:t>no clear</w:t>
+      </w:r>
+      <w:r>
+        <w:rPr>
+          <w:rFonts w:ascii="Arial" w:hAnsi="Arial" w:cs="Arial"/>
+          <w:sz w:val="24"/>
+          <w:szCs w:val="24"/>
+        </w:rPr>
+        <w:t xml:space="preserve"> </w:t>
+      </w:r>
+      <w:r>
+        <w:rPr>
+          <w:rFonts w:ascii="Arial" w:hAnsi="Arial" w:cs="Arial"/>
+          <w:sz w:val="24"/>
+          <w:szCs w:val="24"/>
+        </w:rPr>
+        <w:t>evidence to indicate a negative impact on patient safety, or to support a reduction in hospital acquired infections. Our results do suggest that single</w:t>
+      </w:r>
+      <w:r>
+        <w:rPr>
+          <w:rFonts w:ascii="Arial" w:hAnsi="Arial" w:cs="Arial"/>
+          <w:sz w:val="24"/>
+          <w:szCs w:val="24"/>
+        </w:rPr>
+        <w:t xml:space="preserve"> occupancy</w:t>
+      </w:r>
+      <w:r>
+        <w:rPr>
+          <w:rFonts w:ascii="Arial" w:hAnsi="Arial" w:cs="Arial"/>
+          <w:sz w:val="24"/>
+          <w:szCs w:val="24"/>
+        </w:rPr>
+        <w:t xml:space="preserve"> rooms may negatively impact staff.</w:t>
       </w:r>
     </w:p>
     <w:p>
       <w:pPr>
         <w:rPr>
           <w:rFonts w:ascii="Arial" w:hAnsi="Arial" w:cs="Arial"/>
+          <w:sz w:val="24"/>
+          <w:szCs w:val="24"/>
+        </w:rPr>
+      </w:pPr>
+      <w:r>
+        <w:rPr>
+          <w:rFonts w:ascii="Arial" w:hAnsi="Arial" w:cs="Arial"/>
           <w:i/>
           <w:iCs/>
           <w:sz w:val="24"/>
           <w:szCs w:val="24"/>
         </w:rPr>
-      </w:pPr>
+        <w:lastRenderedPageBreak/>
+        <w:t xml:space="preserve">Figure </w:t>
+      </w:r>
       <w:r>
         <w:rPr>
           <w:rFonts w:ascii="Arial" w:hAnsi="Arial" w:cs="Arial"/>
@@ -2190,7 +2340,17 @@
           <w:sz w:val="24"/>
           <w:szCs w:val="24"/>
         </w:rPr>
-        <w:t>Figure 2. Direction of impacts across hospitals and metrics</w:t>
+        <w:t>3</w:t>
+      </w:r>
+      <w:r>
+        <w:rPr>
+          <w:rFonts w:ascii="Arial" w:hAnsi="Arial" w:cs="Arial"/>
+          <w:i/>
+          <w:iCs/>
+          <w:sz w:val="24"/>
+          <w:szCs w:val="24"/>
+        </w:rPr>
+        <w:t>. Direction of impacts across hospitals and metrics</w:t>
       </w:r>
     </w:p>
     <w:p>
@@ -2209,9 +2369,9 @@
           <w:szCs w:val="24"/>
         </w:rPr>
         <w:drawing>
-          <wp:inline distT="0" distB="0" distL="0" distR="0" wp14:anchorId="62E7E842" wp14:editId="299D5382">
-            <wp:extent cx="5021953" cy="2409825"/>
-            <wp:effectExtent l="0" t="0" r="7620" b="0"/>
+          <wp:inline distT="0" distB="0" distL="0" distR="0" wp14:anchorId="62E7E842" wp14:editId="56C9C7E1">
+            <wp:extent cx="6415396" cy="3078480"/>
+            <wp:effectExtent l="0" t="0" r="5080" b="7620"/>
             <wp:docPr id="754331508" name="Picture 8"/>
             <wp:cNvGraphicFramePr>
               <a:graphicFrameLocks xmlns:a="http://schemas.openxmlformats.org/drawingml/2006/main" noChangeAspect="1"/>
@@ -2221,99 +2381,6 @@
                 <pic:pic xmlns:pic="http://schemas.openxmlformats.org/drawingml/2006/picture">
                   <pic:nvPicPr>
                     <pic:cNvPr id="0" name="Picture 2"/>
-                    <pic:cNvPicPr>
-                      <a:picLocks noChangeAspect="1" noChangeArrowheads="1"/>
-                    </pic:cNvPicPr>
-                  </pic:nvPicPr>
-                  <pic:blipFill>
-                    <a:blip r:embed="rId14" cstate="print">
-                      <a:extLst>
-                        <a:ext uri="{28A0092B-C50C-407E-A947-70E740481C1C}">
-                          <a14:useLocalDpi xmlns:a14="http://schemas.microsoft.com/office/drawing/2010/main" val="0"/>
-                        </a:ext>
-                      </a:extLst>
-                    </a:blip>
-                    <a:srcRect/>
-                    <a:stretch>
-                      <a:fillRect/>
-                    </a:stretch>
-                  </pic:blipFill>
-                  <pic:spPr bwMode="auto">
-                    <a:xfrm>
-                      <a:off x="0" y="0"/>
-                      <a:ext cx="5087958" cy="2441498"/>
-                    </a:xfrm>
-                    <a:prstGeom prst="rect">
-                      <a:avLst/>
-                    </a:prstGeom>
-                    <a:noFill/>
-                  </pic:spPr>
-                </pic:pic>
-              </a:graphicData>
-            </a:graphic>
-          </wp:inline>
-        </w:drawing>
-      </w:r>
-    </w:p>
-    <w:p>
-      <w:pPr>
-        <w:rPr>
-          <w:rFonts w:ascii="Arial" w:hAnsi="Arial" w:cs="Arial"/>
-          <w:sz w:val="24"/>
-          <w:szCs w:val="24"/>
-        </w:rPr>
-      </w:pPr>
-    </w:p>
-    <w:p>
-      <w:pPr>
-        <w:rPr>
-          <w:rFonts w:ascii="Arial" w:hAnsi="Arial" w:cs="Arial"/>
-          <w:i/>
-          <w:iCs/>
-          <w:sz w:val="24"/>
-          <w:szCs w:val="24"/>
-        </w:rPr>
-      </w:pPr>
-      <w:r>
-        <w:rPr>
-          <w:rFonts w:ascii="Arial" w:hAnsi="Arial" w:cs="Arial"/>
-          <w:i/>
-          <w:iCs/>
-          <w:sz w:val="24"/>
-          <w:szCs w:val="24"/>
-        </w:rPr>
-        <w:lastRenderedPageBreak/>
-        <w:t>Figure 3. Examples of CIA for hospital x and length of stay (please choose one!)</w:t>
-      </w:r>
-    </w:p>
-    <w:p>
-      <w:pPr>
-        <w:rPr>
-          <w:rFonts w:ascii="Arial" w:hAnsi="Arial" w:cs="Arial"/>
-          <w:sz w:val="24"/>
-          <w:szCs w:val="24"/>
-        </w:rPr>
-      </w:pPr>
-      <w:r>
-        <w:rPr>
-          <w:rFonts w:ascii="Arial" w:hAnsi="Arial" w:cs="Arial"/>
-          <w:noProof/>
-          <w:sz w:val="24"/>
-          <w:szCs w:val="24"/>
-        </w:rPr>
-        <w:drawing>
-          <wp:inline distT="0" distB="0" distL="0" distR="0" wp14:anchorId="571E0CAB" wp14:editId="30EA5A77">
-            <wp:extent cx="2924175" cy="3057180"/>
-            <wp:effectExtent l="0" t="0" r="0" b="0"/>
-            <wp:docPr id="109411558" name="Picture 9"/>
-            <wp:cNvGraphicFramePr>
-              <a:graphicFrameLocks xmlns:a="http://schemas.openxmlformats.org/drawingml/2006/main" noChangeAspect="1"/>
-            </wp:cNvGraphicFramePr>
-            <a:graphic xmlns:a="http://schemas.openxmlformats.org/drawingml/2006/main">
-              <a:graphicData uri="http://schemas.openxmlformats.org/drawingml/2006/picture">
-                <pic:pic xmlns:pic="http://schemas.openxmlformats.org/drawingml/2006/picture">
-                  <pic:nvPicPr>
-                    <pic:cNvPr id="0" name="Picture 3"/>
                     <pic:cNvPicPr>
                       <a:picLocks noChangeAspect="1" noChangeArrowheads="1"/>
                     </pic:cNvPicPr>
@@ -2334,7 +2401,7 @@
                   <pic:spPr bwMode="auto">
                     <a:xfrm>
                       <a:off x="0" y="0"/>
-                      <a:ext cx="2927777" cy="3060945"/>
+                      <a:ext cx="6422458" cy="3081869"/>
                     </a:xfrm>
                     <a:prstGeom prst="rect">
                       <a:avLst/>
@@ -2352,6 +2419,8 @@
       <w:pPr>
         <w:rPr>
           <w:rFonts w:ascii="Arial" w:hAnsi="Arial" w:cs="Arial"/>
+          <w:i/>
+          <w:iCs/>
           <w:sz w:val="24"/>
           <w:szCs w:val="24"/>
         </w:rPr>
@@ -2361,12 +2430,214 @@
       <w:pPr>
         <w:rPr>
           <w:rFonts w:ascii="Arial" w:hAnsi="Arial" w:cs="Arial"/>
+          <w:i/>
+          <w:iCs/>
+          <w:sz w:val="24"/>
+          <w:szCs w:val="24"/>
+        </w:rPr>
+      </w:pPr>
+      <w:r>
+        <w:rPr>
+          <w:rFonts w:ascii="Arial" w:hAnsi="Arial" w:cs="Arial"/>
+          <w:i/>
+          <w:iCs/>
+          <w:sz w:val="24"/>
+          <w:szCs w:val="24"/>
+        </w:rPr>
+        <w:t xml:space="preserve">Figure </w:t>
+      </w:r>
+      <w:r>
+        <w:rPr>
+          <w:rFonts w:ascii="Arial" w:hAnsi="Arial" w:cs="Arial"/>
+          <w:i/>
+          <w:iCs/>
+          <w:sz w:val="24"/>
+          <w:szCs w:val="24"/>
+        </w:rPr>
+        <w:t>4</w:t>
+      </w:r>
+      <w:r>
+        <w:rPr>
+          <w:rFonts w:ascii="Arial" w:hAnsi="Arial" w:cs="Arial"/>
+          <w:i/>
+          <w:iCs/>
+          <w:sz w:val="24"/>
+          <w:szCs w:val="24"/>
+        </w:rPr>
+        <w:t xml:space="preserve">. </w:t>
+      </w:r>
+      <w:r>
+        <w:rPr>
+          <w:rFonts w:ascii="Arial" w:hAnsi="Arial" w:cs="Arial"/>
+          <w:i/>
+          <w:iCs/>
+          <w:sz w:val="24"/>
+          <w:szCs w:val="24"/>
+        </w:rPr>
+        <w:t xml:space="preserve">Meta-analyses of the </w:t>
+      </w:r>
+      <w:r>
+        <w:rPr>
+          <w:rFonts w:ascii="Arial" w:hAnsi="Arial" w:cs="Arial"/>
+          <w:i/>
+          <w:iCs/>
+          <w:sz w:val="24"/>
+          <w:szCs w:val="24"/>
+        </w:rPr>
+        <w:t>impacts at general acute hospitals (specialist providers were excluded as the</w:t>
+      </w:r>
+      <w:r>
+        <w:rPr>
+          <w:rFonts w:ascii="Arial" w:hAnsi="Arial" w:cs="Arial"/>
+          <w:i/>
+          <w:iCs/>
+          <w:sz w:val="24"/>
+          <w:szCs w:val="24"/>
+        </w:rPr>
+        <w:t>i</w:t>
+      </w:r>
+      <w:r>
+        <w:rPr>
+          <w:rFonts w:ascii="Arial" w:hAnsi="Arial" w:cs="Arial"/>
+          <w:i/>
+          <w:iCs/>
+          <w:sz w:val="24"/>
+          <w:szCs w:val="24"/>
+        </w:rPr>
+        <w:t>r</w:t>
+      </w:r>
+      <w:r>
+        <w:rPr>
+          <w:rFonts w:ascii="Arial" w:hAnsi="Arial" w:cs="Arial"/>
+          <w:i/>
+          <w:iCs/>
+          <w:sz w:val="24"/>
+          <w:szCs w:val="24"/>
+        </w:rPr>
+        <w:t xml:space="preserve"> results may not be </w:t>
+      </w:r>
+      <w:r>
+        <w:rPr>
+          <w:rFonts w:ascii="Arial" w:hAnsi="Arial" w:cs="Arial"/>
+          <w:i/>
+          <w:iCs/>
+          <w:sz w:val="24"/>
+          <w:szCs w:val="24"/>
+        </w:rPr>
+        <w:t>generalisab</w:t>
+      </w:r>
+      <w:r>
+        <w:rPr>
+          <w:rFonts w:ascii="Arial" w:hAnsi="Arial" w:cs="Arial"/>
+          <w:i/>
+          <w:iCs/>
+          <w:sz w:val="24"/>
+          <w:szCs w:val="24"/>
+        </w:rPr>
+        <w:t xml:space="preserve">le </w:t>
+      </w:r>
+      <w:r>
+        <w:rPr>
+          <w:rFonts w:ascii="Arial" w:hAnsi="Arial" w:cs="Arial"/>
+          <w:i/>
+          <w:iCs/>
+          <w:sz w:val="24"/>
+          <w:szCs w:val="24"/>
+        </w:rPr>
+        <w:t>to</w:t>
+      </w:r>
+      <w:r>
+        <w:rPr>
+          <w:rFonts w:ascii="Arial" w:hAnsi="Arial" w:cs="Arial"/>
+          <w:i/>
+          <w:iCs/>
+          <w:sz w:val="24"/>
+          <w:szCs w:val="24"/>
+        </w:rPr>
+        <w:t xml:space="preserve"> future general acute hospitals)</w:t>
+      </w:r>
+    </w:p>
+    <w:p>
+      <w:pPr>
+        <w:rPr>
+          <w:rFonts w:ascii="Arial" w:hAnsi="Arial" w:cs="Arial"/>
+          <w:sz w:val="24"/>
+          <w:szCs w:val="24"/>
+        </w:rPr>
+      </w:pPr>
+      <w:r>
+        <w:rPr>
+          <w:rFonts w:ascii="Arial" w:hAnsi="Arial" w:cs="Arial"/>
+          <w:noProof/>
+          <w:sz w:val="24"/>
+          <w:szCs w:val="24"/>
+        </w:rPr>
+        <w:drawing>
+          <wp:inline distT="0" distB="0" distL="0" distR="0" wp14:anchorId="1D8FA515" wp14:editId="543870E7">
+            <wp:extent cx="6415286" cy="3202940"/>
+            <wp:effectExtent l="0" t="0" r="5080" b="0"/>
+            <wp:docPr id="855330380" name="Picture 7"/>
+            <wp:cNvGraphicFramePr>
+              <a:graphicFrameLocks xmlns:a="http://schemas.openxmlformats.org/drawingml/2006/main" noChangeAspect="1"/>
+            </wp:cNvGraphicFramePr>
+            <a:graphic xmlns:a="http://schemas.openxmlformats.org/drawingml/2006/main">
+              <a:graphicData uri="http://schemas.openxmlformats.org/drawingml/2006/picture">
+                <pic:pic xmlns:pic="http://schemas.openxmlformats.org/drawingml/2006/picture">
+                  <pic:nvPicPr>
+                    <pic:cNvPr id="0" name="Picture 2"/>
+                    <pic:cNvPicPr>
+                      <a:picLocks noChangeAspect="1" noChangeArrowheads="1"/>
+                    </pic:cNvPicPr>
+                  </pic:nvPicPr>
+                  <pic:blipFill>
+                    <a:blip r:embed="rId16">
+                      <a:extLst>
+                        <a:ext uri="{28A0092B-C50C-407E-A947-70E740481C1C}">
+                          <a14:useLocalDpi xmlns:a14="http://schemas.microsoft.com/office/drawing/2010/main" val="0"/>
+                        </a:ext>
+                      </a:extLst>
+                    </a:blip>
+                    <a:srcRect/>
+                    <a:stretch>
+                      <a:fillRect/>
+                    </a:stretch>
+                  </pic:blipFill>
+                  <pic:spPr bwMode="auto">
+                    <a:xfrm>
+                      <a:off x="0" y="0"/>
+                      <a:ext cx="6431570" cy="3211070"/>
+                    </a:xfrm>
+                    <a:prstGeom prst="rect">
+                      <a:avLst/>
+                    </a:prstGeom>
+                    <a:noFill/>
+                  </pic:spPr>
+                </pic:pic>
+              </a:graphicData>
+            </a:graphic>
+          </wp:inline>
+        </w:drawing>
+      </w:r>
+    </w:p>
+    <w:p>
+      <w:pPr>
+        <w:rPr>
+          <w:rFonts w:ascii="Arial" w:hAnsi="Arial" w:cs="Arial"/>
+          <w:sz w:val="24"/>
+          <w:szCs w:val="24"/>
+        </w:rPr>
+      </w:pPr>
+      <w:r>
+        <w:rPr>
+          <w:rFonts w:ascii="Arial" w:hAnsi="Arial" w:cs="Arial"/>
           <w:b/>
           <w:bCs/>
           <w:sz w:val="24"/>
           <w:szCs w:val="24"/>
         </w:rPr>
-      </w:pPr>
+        <w:lastRenderedPageBreak/>
+        <w:t xml:space="preserve">Limitations and </w:t>
+      </w:r>
       <w:r>
         <w:rPr>
           <w:rFonts w:ascii="Arial" w:hAnsi="Arial" w:cs="Arial"/>
@@ -2375,9 +2646,11 @@
           <w:sz w:val="24"/>
           <w:szCs w:val="24"/>
         </w:rPr>
-        <w:t xml:space="preserve">Limitations and </w:t>
-      </w:r>
-      <w:r>
+        <w:t>Discussion:</w:t>
+      </w:r>
+    </w:p>
+    <w:p>
+      <w:pPr>
         <w:rPr>
           <w:rFonts w:ascii="Arial" w:hAnsi="Arial" w:cs="Arial"/>
           <w:b/>
@@ -2385,28 +2658,151 @@
           <w:sz w:val="24"/>
           <w:szCs w:val="24"/>
         </w:rPr>
-        <w:t>Discussion:</w:t>
+      </w:pPr>
+      <w:r>
+        <w:rPr>
+          <w:rFonts w:ascii="Arial" w:hAnsi="Arial" w:cs="Arial"/>
+          <w:b/>
+          <w:bCs/>
+          <w:sz w:val="24"/>
+          <w:szCs w:val="24"/>
+        </w:rPr>
+        <w:t>Limitations</w:t>
       </w:r>
     </w:p>
     <w:p>
       <w:pPr>
         <w:rPr>
           <w:rFonts w:ascii="Arial" w:hAnsi="Arial" w:cs="Arial"/>
-          <w:b/>
-          <w:bCs/>
-          <w:sz w:val="24"/>
-          <w:szCs w:val="24"/>
-        </w:rPr>
-      </w:pPr>
-      <w:r>
-        <w:rPr>
-          <w:rFonts w:ascii="Arial" w:hAnsi="Arial" w:cs="Arial"/>
-          <w:b/>
-          <w:bCs/>
-          <w:sz w:val="24"/>
-          <w:szCs w:val="24"/>
-        </w:rPr>
-        <w:t>Limitations….</w:t>
+          <w:sz w:val="24"/>
+          <w:szCs w:val="24"/>
+        </w:rPr>
+      </w:pPr>
+      <w:r>
+        <w:rPr>
+          <w:rFonts w:ascii="Arial" w:hAnsi="Arial" w:cs="Arial"/>
+          <w:sz w:val="24"/>
+          <w:szCs w:val="24"/>
+        </w:rPr>
+        <w:t xml:space="preserve">Our analyses rely on historical data collections meaning that some data recording does not go back as far enough to use for all the study hospitals (e.g. reporting of </w:t>
+      </w:r>
+      <w:proofErr w:type="spellStart"/>
+      <w:proofErr w:type="gramStart"/>
+      <w:r>
+        <w:rPr>
+          <w:rFonts w:ascii="Arial" w:hAnsi="Arial" w:cs="Arial"/>
+          <w:sz w:val="24"/>
+          <w:szCs w:val="24"/>
+        </w:rPr>
+        <w:t>c.difficile</w:t>
+      </w:r>
+      <w:proofErr w:type="spellEnd"/>
+      <w:proofErr w:type="gramEnd"/>
+      <w:r>
+        <w:rPr>
+          <w:rFonts w:ascii="Arial" w:hAnsi="Arial" w:cs="Arial"/>
+          <w:sz w:val="24"/>
+          <w:szCs w:val="24"/>
+        </w:rPr>
+        <w:t xml:space="preserve"> infections) or there are gaps/anomalies in the time series. </w:t>
+      </w:r>
+      <w:r>
+        <w:rPr>
+          <w:rFonts w:ascii="Arial" w:hAnsi="Arial" w:cs="Arial"/>
+          <w:sz w:val="24"/>
+          <w:szCs w:val="24"/>
+        </w:rPr>
+        <w:t xml:space="preserve">Indeed, it was </w:t>
+      </w:r>
+      <w:r>
+        <w:rPr>
+          <w:rFonts w:ascii="Arial" w:hAnsi="Arial" w:cs="Arial"/>
+          <w:sz w:val="24"/>
+          <w:szCs w:val="24"/>
+        </w:rPr>
+        <w:t xml:space="preserve">difficult to determine the exact percentage of single-bed rooms in the </w:t>
+      </w:r>
+      <w:r>
+        <w:rPr>
+          <w:rFonts w:ascii="Arial" w:hAnsi="Arial" w:cs="Arial"/>
+          <w:sz w:val="24"/>
+          <w:szCs w:val="24"/>
+        </w:rPr>
+        <w:t xml:space="preserve">study </w:t>
+      </w:r>
+      <w:r>
+        <w:rPr>
+          <w:rFonts w:ascii="Arial" w:hAnsi="Arial" w:cs="Arial"/>
+          <w:sz w:val="24"/>
+          <w:szCs w:val="24"/>
+        </w:rPr>
+        <w:t>hospitals with the data available.</w:t>
+      </w:r>
+      <w:r>
+        <w:rPr>
+          <w:rFonts w:ascii="Arial" w:hAnsi="Arial" w:cs="Arial"/>
+          <w:sz w:val="24"/>
+          <w:szCs w:val="24"/>
+        </w:rPr>
+        <w:t xml:space="preserve"> </w:t>
+      </w:r>
+      <w:r>
+        <w:rPr>
+          <w:rFonts w:ascii="Arial" w:hAnsi="Arial" w:cs="Arial"/>
+          <w:sz w:val="24"/>
+          <w:szCs w:val="24"/>
+        </w:rPr>
+        <w:t xml:space="preserve">There are also a few cases where we were not able to fit appropriate causal impact models. Some data were affected by COVID-19; causal impact analysis will have accounted for COVID-19 effects where the magnitude was similar between control and study sites, but when the magnitude of the COVID-19 effects </w:t>
+      </w:r>
+      <w:proofErr w:type="gramStart"/>
+      <w:r>
+        <w:rPr>
+          <w:rFonts w:ascii="Arial" w:hAnsi="Arial" w:cs="Arial"/>
+          <w:sz w:val="24"/>
+          <w:szCs w:val="24"/>
+        </w:rPr>
+        <w:t>were</w:t>
+      </w:r>
+      <w:proofErr w:type="gramEnd"/>
+      <w:r>
+        <w:rPr>
+          <w:rFonts w:ascii="Arial" w:hAnsi="Arial" w:cs="Arial"/>
+          <w:sz w:val="24"/>
+          <w:szCs w:val="24"/>
+        </w:rPr>
+        <w:t xml:space="preserve"> greater at the study site compared to their control sites</w:t>
+      </w:r>
+      <w:r>
+        <w:rPr>
+          <w:rFonts w:ascii="Arial" w:hAnsi="Arial" w:cs="Arial"/>
+          <w:sz w:val="24"/>
+          <w:szCs w:val="24"/>
+        </w:rPr>
+        <w:t xml:space="preserve"> </w:t>
+      </w:r>
+      <w:r>
+        <w:rPr>
+          <w:rFonts w:ascii="Arial" w:hAnsi="Arial" w:cs="Arial"/>
+          <w:sz w:val="24"/>
+          <w:szCs w:val="24"/>
+        </w:rPr>
+        <w:t xml:space="preserve">some results have had to be excluded. This means for some measures we have limited data which may impact the reliability of our findings. The number of sites in the control pool was very limited for </w:t>
+      </w:r>
+      <w:r>
+        <w:rPr>
+          <w:rFonts w:ascii="Arial" w:hAnsi="Arial" w:cs="Arial"/>
+          <w:sz w:val="24"/>
+          <w:szCs w:val="24"/>
+        </w:rPr>
+        <w:t>two of the specialist centres</w:t>
+      </w:r>
+      <w:r>
+        <w:rPr>
+          <w:rFonts w:ascii="Arial" w:hAnsi="Arial" w:cs="Arial"/>
+          <w:sz w:val="24"/>
+          <w:szCs w:val="24"/>
+        </w:rPr>
+        <w:t xml:space="preserve">, which may have impacted the quality of the model fit and reliability of the outcomes. Furthermore, our meta-analyses are limited due having only 4 general acute hospital study sites. </w:t>
       </w:r>
     </w:p>
     <w:p>
@@ -2423,23 +2819,49 @@
           <w:sz w:val="24"/>
           <w:szCs w:val="24"/>
         </w:rPr>
-        <w:t>Data</w:t>
-      </w:r>
-      <w:r>
-        <w:rPr>
-          <w:rFonts w:ascii="Arial" w:hAnsi="Arial" w:cs="Arial"/>
-          <w:sz w:val="24"/>
-          <w:szCs w:val="24"/>
-        </w:rPr>
-        <w:t>, specificity, measuring SBR %</w:t>
-      </w:r>
-      <w:r>
-        <w:rPr>
-          <w:rFonts w:ascii="Arial" w:hAnsi="Arial" w:cs="Arial"/>
-          <w:sz w:val="24"/>
-          <w:szCs w:val="24"/>
-        </w:rPr>
-        <w:t xml:space="preserve"> etc…</w:t>
+        <w:t>Some variables are only available at provider level, so where providers have more than one site any change that may occur following a switch to single bedrooms at one site will be diluted by a lack of change at the providers other sites. Some measures are recorded quarterly (bed occupancy) or annually (cleaning costs and staff survey), so we have less data points with which to fit our models and assess outcomes, and less temporal specificity to detect changes.</w:t>
+      </w:r>
+    </w:p>
+    <w:p>
+      <w:pPr>
+        <w:rPr>
+          <w:rFonts w:ascii="Arial" w:hAnsi="Arial" w:cs="Arial"/>
+          <w:sz w:val="24"/>
+          <w:szCs w:val="24"/>
+        </w:rPr>
+      </w:pPr>
+      <w:r>
+        <w:rPr>
+          <w:rFonts w:ascii="Arial" w:hAnsi="Arial" w:cs="Arial"/>
+          <w:sz w:val="24"/>
+          <w:szCs w:val="24"/>
+        </w:rPr>
+        <w:t xml:space="preserve">To assess some of the impacts of interest we have needed to use a proxy measure, e.g. staff sickness and staff turnover as a proxy for staff experience and median waiting time as a proxy for hospital productivity. </w:t>
+      </w:r>
+    </w:p>
+    <w:p>
+      <w:pPr>
+        <w:rPr>
+          <w:rFonts w:ascii="Arial" w:hAnsi="Arial" w:cs="Arial"/>
+          <w:sz w:val="24"/>
+          <w:szCs w:val="24"/>
+        </w:rPr>
+      </w:pPr>
+      <w:r>
+        <w:rPr>
+          <w:rFonts w:ascii="Arial" w:hAnsi="Arial" w:cs="Arial"/>
+          <w:sz w:val="24"/>
+          <w:szCs w:val="24"/>
+        </w:rPr>
+        <w:t>When the sites switched to single bedrooms there are likely to have been other changes to how services operate and at multi-site providers there may also have been changes to what services are provided at which sites, hence there are likely to be confounding factors that influence our results.</w:t>
+      </w:r>
+      <w:r>
+        <w:rPr>
+          <w:rFonts w:ascii="Arial" w:hAnsi="Arial" w:cs="Arial"/>
+          <w:sz w:val="24"/>
+          <w:szCs w:val="24"/>
+        </w:rPr>
+        <w:t xml:space="preserve"> </w:t>
       </w:r>
     </w:p>
     <w:p>
@@ -2597,6 +3019,7 @@
           <w:sz w:val="24"/>
           <w:szCs w:val="24"/>
         </w:rPr>
+        <w:lastRenderedPageBreak/>
         <w:t xml:space="preserve">quick-response patient and staff </w:t>
       </w:r>
       <w:r>
@@ -2685,13 +3108,289 @@
         </w:rPr>
       </w:pPr>
     </w:p>
+    <w:p>
+      <w:pPr>
+        <w:rPr>
+          <w:rFonts w:ascii="Arial" w:hAnsi="Arial" w:cs="Arial"/>
+          <w:b/>
+          <w:bCs/>
+          <w:sz w:val="24"/>
+          <w:szCs w:val="24"/>
+        </w:rPr>
+      </w:pPr>
+      <w:r>
+        <w:rPr>
+          <w:rFonts w:ascii="Arial" w:hAnsi="Arial" w:cs="Arial"/>
+          <w:b/>
+          <w:bCs/>
+          <w:sz w:val="24"/>
+          <w:szCs w:val="24"/>
+        </w:rPr>
+        <w:t>References</w:t>
+      </w:r>
+    </w:p>
+    <w:p>
+      <w:pPr>
+        <w:rPr>
+          <w:rFonts w:ascii="Arial" w:hAnsi="Arial" w:cs="Arial"/>
+          <w:sz w:val="24"/>
+          <w:szCs w:val="24"/>
+        </w:rPr>
+      </w:pPr>
+      <w:r>
+        <w:rPr>
+          <w:rFonts w:ascii="Arial" w:hAnsi="Arial" w:cs="Arial"/>
+          <w:sz w:val="24"/>
+          <w:szCs w:val="24"/>
+        </w:rPr>
+        <w:t>Bertuzzi A, Martin A, Clarke N et al. Clinical, humanistic and economic outcomes, including experiencing of patient safety events, associated with admitting patients to single rooms compared with shared accommodation for acute hospital admissions: a systematic review and narrative synthesis. BMJ Open. 2023 May 5;13(5</w:t>
+      </w:r>
+      <w:proofErr w:type="gramStart"/>
+      <w:r>
+        <w:rPr>
+          <w:rFonts w:ascii="Arial" w:hAnsi="Arial" w:cs="Arial"/>
+          <w:sz w:val="24"/>
+          <w:szCs w:val="24"/>
+        </w:rPr>
+        <w:t>):e</w:t>
+      </w:r>
+      <w:proofErr w:type="gramEnd"/>
+      <w:r>
+        <w:rPr>
+          <w:rFonts w:ascii="Arial" w:hAnsi="Arial" w:cs="Arial"/>
+          <w:sz w:val="24"/>
+          <w:szCs w:val="24"/>
+        </w:rPr>
+        <w:t xml:space="preserve">068932. </w:t>
+      </w:r>
+      <w:proofErr w:type="spellStart"/>
+      <w:r>
+        <w:rPr>
+          <w:rFonts w:ascii="Arial" w:hAnsi="Arial" w:cs="Arial"/>
+          <w:sz w:val="24"/>
+          <w:szCs w:val="24"/>
+        </w:rPr>
+        <w:t>doi</w:t>
+      </w:r>
+      <w:proofErr w:type="spellEnd"/>
+      <w:r>
+        <w:rPr>
+          <w:rFonts w:ascii="Arial" w:hAnsi="Arial" w:cs="Arial"/>
+          <w:sz w:val="24"/>
+          <w:szCs w:val="24"/>
+        </w:rPr>
+        <w:t>: 10.1136/bmjopen-2022-068932.</w:t>
+      </w:r>
+    </w:p>
+    <w:p>
+      <w:pPr>
+        <w:rPr>
+          <w:rFonts w:ascii="Arial" w:hAnsi="Arial" w:cs="Arial"/>
+          <w:sz w:val="24"/>
+          <w:szCs w:val="24"/>
+        </w:rPr>
+      </w:pPr>
+      <w:r>
+        <w:rPr>
+          <w:rFonts w:ascii="Arial" w:hAnsi="Arial" w:cs="Arial"/>
+          <w:sz w:val="24"/>
+          <w:szCs w:val="24"/>
+        </w:rPr>
+        <w:t>Brodersen KH, Gallusser F, Koehler J et al. Inferring causal impact using Bayesian structural time-series models. The Annals of Applied Statistics. 2015 9(1), 247-274</w:t>
+      </w:r>
+    </w:p>
+    <w:p>
+      <w:pPr>
+        <w:rPr>
+          <w:rFonts w:ascii="Arial" w:hAnsi="Arial" w:cs="Arial"/>
+          <w:sz w:val="24"/>
+          <w:szCs w:val="24"/>
+        </w:rPr>
+      </w:pPr>
+      <w:r>
+        <w:rPr>
+          <w:rFonts w:ascii="Arial" w:hAnsi="Arial" w:cs="Arial"/>
+          <w:sz w:val="24"/>
+          <w:szCs w:val="24"/>
+        </w:rPr>
+        <w:t xml:space="preserve">Taylor E, Card AJ, Piatkowski M. Single-Occupancy Patient Rooms: A Systematic Review of the Literature Since 2006. HERD. 2018 Jan;11(1):85-100. </w:t>
+      </w:r>
+      <w:proofErr w:type="spellStart"/>
+      <w:r>
+        <w:rPr>
+          <w:rFonts w:ascii="Arial" w:hAnsi="Arial" w:cs="Arial"/>
+          <w:sz w:val="24"/>
+          <w:szCs w:val="24"/>
+        </w:rPr>
+        <w:t>doi</w:t>
+      </w:r>
+      <w:proofErr w:type="spellEnd"/>
+      <w:r>
+        <w:rPr>
+          <w:rFonts w:ascii="Arial" w:hAnsi="Arial" w:cs="Arial"/>
+          <w:sz w:val="24"/>
+          <w:szCs w:val="24"/>
+        </w:rPr>
+        <w:t>: 10.1177/1937586718755110.</w:t>
+      </w:r>
+    </w:p>
+    <w:p>
+      <w:pPr>
+        <w:rPr>
+          <w:rFonts w:ascii="Arial" w:hAnsi="Arial" w:cs="Arial"/>
+          <w:sz w:val="24"/>
+          <w:szCs w:val="24"/>
+        </w:rPr>
+      </w:pPr>
+      <w:r>
+        <w:rPr>
+          <w:rFonts w:ascii="Arial" w:hAnsi="Arial" w:cs="Arial"/>
+          <w:sz w:val="24"/>
+          <w:szCs w:val="24"/>
+        </w:rPr>
+        <w:t xml:space="preserve">van de </w:t>
+      </w:r>
+      <w:proofErr w:type="spellStart"/>
+      <w:r>
+        <w:rPr>
+          <w:rFonts w:ascii="Arial" w:hAnsi="Arial" w:cs="Arial"/>
+          <w:sz w:val="24"/>
+          <w:szCs w:val="24"/>
+        </w:rPr>
+        <w:t>Glind</w:t>
+      </w:r>
+      <w:proofErr w:type="spellEnd"/>
+      <w:r>
+        <w:rPr>
+          <w:rFonts w:ascii="Arial" w:hAnsi="Arial" w:cs="Arial"/>
+          <w:sz w:val="24"/>
+          <w:szCs w:val="24"/>
+        </w:rPr>
+        <w:t xml:space="preserve"> I, de Roode S, </w:t>
+      </w:r>
+      <w:proofErr w:type="spellStart"/>
+      <w:r>
+        <w:rPr>
+          <w:rFonts w:ascii="Arial" w:hAnsi="Arial" w:cs="Arial"/>
+          <w:sz w:val="24"/>
+          <w:szCs w:val="24"/>
+        </w:rPr>
+        <w:t>Goossensen</w:t>
+      </w:r>
+      <w:proofErr w:type="spellEnd"/>
+      <w:r>
+        <w:rPr>
+          <w:rFonts w:ascii="Arial" w:hAnsi="Arial" w:cs="Arial"/>
+          <w:sz w:val="24"/>
+          <w:szCs w:val="24"/>
+        </w:rPr>
+        <w:t xml:space="preserve"> A. Do patients in hospitals benefit from single rooms? A literature review. Health Policy. 2007 Dec;84(2-3):153-61. </w:t>
+      </w:r>
+      <w:proofErr w:type="spellStart"/>
+      <w:r>
+        <w:rPr>
+          <w:rFonts w:ascii="Arial" w:hAnsi="Arial" w:cs="Arial"/>
+          <w:sz w:val="24"/>
+          <w:szCs w:val="24"/>
+        </w:rPr>
+        <w:t>doi</w:t>
+      </w:r>
+      <w:proofErr w:type="spellEnd"/>
+      <w:r>
+        <w:rPr>
+          <w:rFonts w:ascii="Arial" w:hAnsi="Arial" w:cs="Arial"/>
+          <w:sz w:val="24"/>
+          <w:szCs w:val="24"/>
+        </w:rPr>
+        <w:t>: 10.1016/j.healthpol.2007.06.002.</w:t>
+      </w:r>
+    </w:p>
+    <w:p>
+      <w:pPr>
+        <w:rPr>
+          <w:rFonts w:ascii="Arial" w:hAnsi="Arial" w:cs="Arial"/>
+          <w:sz w:val="24"/>
+          <w:szCs w:val="24"/>
+        </w:rPr>
+      </w:pPr>
+      <w:r>
+        <w:rPr>
+          <w:rFonts w:ascii="Arial" w:hAnsi="Arial" w:cs="Arial"/>
+          <w:sz w:val="24"/>
+          <w:szCs w:val="24"/>
+        </w:rPr>
+        <w:t xml:space="preserve">Voigt J, Mosier M, </w:t>
+      </w:r>
+      <w:proofErr w:type="spellStart"/>
+      <w:r>
+        <w:rPr>
+          <w:rFonts w:ascii="Arial" w:hAnsi="Arial" w:cs="Arial"/>
+          <w:sz w:val="24"/>
+          <w:szCs w:val="24"/>
+        </w:rPr>
+        <w:t>Darouiche</w:t>
+      </w:r>
+      <w:proofErr w:type="spellEnd"/>
+      <w:r>
+        <w:rPr>
+          <w:rFonts w:ascii="Arial" w:hAnsi="Arial" w:cs="Arial"/>
+          <w:sz w:val="24"/>
+          <w:szCs w:val="24"/>
+        </w:rPr>
+        <w:t xml:space="preserve"> R. Private Rooms in Low Acuity Settings: A Systematic Review of the Literature. HERD. 2018 Jan;11(1):57-74. </w:t>
+      </w:r>
+      <w:proofErr w:type="spellStart"/>
+      <w:r>
+        <w:rPr>
+          <w:rFonts w:ascii="Arial" w:hAnsi="Arial" w:cs="Arial"/>
+          <w:sz w:val="24"/>
+          <w:szCs w:val="24"/>
+        </w:rPr>
+        <w:t>doi</w:t>
+      </w:r>
+      <w:proofErr w:type="spellEnd"/>
+      <w:r>
+        <w:rPr>
+          <w:rFonts w:ascii="Arial" w:hAnsi="Arial" w:cs="Arial"/>
+          <w:sz w:val="24"/>
+          <w:szCs w:val="24"/>
+        </w:rPr>
+        <w:t xml:space="preserve">: 10.1177/1937586717702597. </w:t>
+      </w:r>
+    </w:p>
+    <w:p>
+      <w:pPr>
+        <w:rPr>
+          <w:rFonts w:ascii="Arial" w:hAnsi="Arial" w:cs="Arial"/>
+          <w:sz w:val="24"/>
+          <w:szCs w:val="24"/>
+        </w:rPr>
+      </w:pPr>
+      <w:r>
+        <w:rPr>
+          <w:rFonts w:ascii="Arial" w:hAnsi="Arial" w:cs="Arial"/>
+          <w:sz w:val="24"/>
+          <w:szCs w:val="24"/>
+        </w:rPr>
+        <w:tab/>
+      </w:r>
+    </w:p>
+    <w:p>
+      <w:pPr>
+        <w:rPr>
+          <w:rFonts w:ascii="Arial" w:hAnsi="Arial" w:cs="Arial"/>
+          <w:sz w:val="24"/>
+          <w:szCs w:val="24"/>
+        </w:rPr>
+      </w:pPr>
+    </w:p>
     <w:sectPr>
-      <w:headerReference w:type="even" r:id="rId16"/>
-      <w:headerReference w:type="default" r:id="rId17"/>
-      <w:footerReference w:type="even" r:id="rId18"/>
-      <w:footerReference w:type="default" r:id="rId19"/>
-      <w:headerReference w:type="first" r:id="rId20"/>
-      <w:footerReference w:type="first" r:id="rId21"/>
+      <w:headerReference w:type="even" r:id="rId17"/>
+      <w:headerReference w:type="default" r:id="rId18"/>
+      <w:footerReference w:type="even" r:id="rId19"/>
+      <w:footerReference w:type="default" r:id="rId20"/>
+      <w:headerReference w:type="first" r:id="rId21"/>
+      <w:footerReference w:type="first" r:id="rId22"/>
       <w:pgSz w:w="11906" w:h="16838"/>
       <w:pgMar w:top="720" w:right="720" w:bottom="720" w:left="720" w:header="567" w:footer="1134" w:gutter="0"/>
       <w:pgNumType w:start="0"/>
@@ -8614,6 +9313,7 @@
   <w:style w:type="character" w:default="1" w:styleId="DefaultParagraphFont">
     <w:name w:val="Default Paragraph Font"/>
     <w:uiPriority w:val="1"/>
+    <w:semiHidden/>
     <w:unhideWhenUsed/>
   </w:style>
   <w:style w:type="table" w:default="1" w:styleId="TableNormal">
@@ -8870,6 +9570,20 @@
     <w:link w:val="NoSpacing"/>
     <w:uiPriority w:val="1"/>
     <w:rsid w:val="00F179F1"/>
+  </w:style>
+  <w:style w:type="paragraph" w:styleId="Revision">
+    <w:name w:val="Revision"/>
+    <w:hidden/>
+    <w:uiPriority w:val="99"/>
+    <w:semiHidden/>
+    <w:rsid w:val="00D21203"/>
+    <w:pPr>
+      <w:spacing w:after="0" w:line="240" w:lineRule="auto"/>
+    </w:pPr>
+    <w:rPr>
+      <w:kern w:val="2"/>
+      <w14:ligatures w14:val="standardContextual"/>
+    </w:rPr>
   </w:style>
 </w:styles>
 </file>
@@ -9181,21 +9895,15 @@
 </file>
 
 <file path=customXml/item2.xml><?xml version="1.0" encoding="utf-8"?>
-<b:Sources xmlns:b="http://schemas.openxmlformats.org/officeDocument/2006/bibliography" xmlns="http://schemas.openxmlformats.org/officeDocument/2006/bibliography" SelectedStyle="\APASixthEditionOfficeOnline.xsl" StyleName="APA" Version="6"/>
+<?mso-contentType ?>
+<FormTemplates xmlns="http://schemas.microsoft.com/sharepoint/v3/contenttype/forms">
+  <Display>DocumentLibraryForm</Display>
+  <Edit>DocumentLibraryForm</Edit>
+  <New>DocumentLibraryForm</New>
+</FormTemplates>
 </file>
 
 <file path=customXml/item3.xml><?xml version="1.0" encoding="utf-8"?>
-<p:properties xmlns:p="http://schemas.microsoft.com/office/2006/metadata/properties" xmlns:xsi="http://www.w3.org/2001/XMLSchema-instance" xmlns:pc="http://schemas.microsoft.com/office/infopath/2007/PartnerControls">
-  <documentManagement>
-    <lcf76f155ced4ddcb4097134ff3c332f xmlns="6303f13c-72cc-47f0-aeed-d46f93b29717">
-      <Terms xmlns="http://schemas.microsoft.com/office/infopath/2007/PartnerControls"/>
-    </lcf76f155ced4ddcb4097134ff3c332f>
-    <TaxCatchAll xmlns="6fbcc8e4-81ed-40b2-9b21-aa98bc8e658d" xsi:nil="true"/>
-  </documentManagement>
-</p:properties>
-</file>
-
-<file path=customXml/item4.xml><?xml version="1.0" encoding="utf-8"?>
 <ct:contentTypeSchema xmlns:ct="http://schemas.microsoft.com/office/2006/metadata/contentType" xmlns:ma="http://schemas.microsoft.com/office/2006/metadata/properties/metaAttributes" ct:_="" ma:_="" ma:contentTypeName="Document" ma:contentTypeID="0x01010003C3297AEF9452489C7FCE3B7D0A0240" ma:contentTypeVersion="18" ma:contentTypeDescription="Create a new document." ma:contentTypeScope="" ma:versionID="1ccb097adaeed9eb0eeb9354c7c3f9c4">
   <xsd:schema xmlns:xsd="http://www.w3.org/2001/XMLSchema" xmlns:xs="http://www.w3.org/2001/XMLSchema" xmlns:p="http://schemas.microsoft.com/office/2006/metadata/properties" xmlns:ns2="6303f13c-72cc-47f0-aeed-d46f93b29717" xmlns:ns3="6fbcc8e4-81ed-40b2-9b21-aa98bc8e658d" targetNamespace="http://schemas.microsoft.com/office/2006/metadata/properties" ma:root="true" ma:fieldsID="66ecee001987cab92525588c62778a1f" ns2:_="" ns3:_="">
     <xsd:import namespace="6303f13c-72cc-47f0-aeed-d46f93b29717"/>
@@ -9450,13 +10158,19 @@
 </ct:contentTypeSchema>
 </file>
 
+<file path=customXml/item4.xml><?xml version="1.0" encoding="utf-8"?>
+<p:properties xmlns:p="http://schemas.microsoft.com/office/2006/metadata/properties" xmlns:xsi="http://www.w3.org/2001/XMLSchema-instance" xmlns:pc="http://schemas.microsoft.com/office/infopath/2007/PartnerControls">
+  <documentManagement>
+    <lcf76f155ced4ddcb4097134ff3c332f xmlns="6303f13c-72cc-47f0-aeed-d46f93b29717">
+      <Terms xmlns="http://schemas.microsoft.com/office/infopath/2007/PartnerControls"/>
+    </lcf76f155ced4ddcb4097134ff3c332f>
+    <TaxCatchAll xmlns="6fbcc8e4-81ed-40b2-9b21-aa98bc8e658d" xsi:nil="true"/>
+  </documentManagement>
+</p:properties>
+</file>
+
 <file path=customXml/item5.xml><?xml version="1.0" encoding="utf-8"?>
-<?mso-contentType ?>
-<FormTemplates xmlns="http://schemas.microsoft.com/sharepoint/v3/contenttype/forms">
-  <Display>DocumentLibraryForm</Display>
-  <Edit>DocumentLibraryForm</Edit>
-  <New>DocumentLibraryForm</New>
-</FormTemplates>
+<b:Sources xmlns:b="http://schemas.openxmlformats.org/officeDocument/2006/bibliography" xmlns="http://schemas.openxmlformats.org/officeDocument/2006/bibliography" SelectedStyle="\APASixthEditionOfficeOnline.xsl" StyleName="APA" Version="6"/>
 </file>
 
 <file path=customXml/itemProps1.xml><?xml version="1.0" encoding="utf-8"?>
@@ -9468,25 +10182,14 @@
 </file>
 
 <file path=customXml/itemProps2.xml><?xml version="1.0" encoding="utf-8"?>
-<ds:datastoreItem xmlns:ds="http://schemas.openxmlformats.org/officeDocument/2006/customXml" ds:itemID="{308B3A6F-517D-402D-9A9B-F8F60567BA9F}">
+<ds:datastoreItem xmlns:ds="http://schemas.openxmlformats.org/officeDocument/2006/customXml" ds:itemID="{39A65323-01AA-47E8-8448-C5C7A000691D}">
   <ds:schemaRefs>
-    <ds:schemaRef ds:uri="http://schemas.openxmlformats.org/officeDocument/2006/bibliography"/>
+    <ds:schemaRef ds:uri="http://schemas.microsoft.com/sharepoint/v3/contenttype/forms"/>
   </ds:schemaRefs>
 </ds:datastoreItem>
 </file>
 
 <file path=customXml/itemProps3.xml><?xml version="1.0" encoding="utf-8"?>
-<ds:datastoreItem xmlns:ds="http://schemas.openxmlformats.org/officeDocument/2006/customXml" ds:itemID="{9808B4E2-4289-4E8E-B008-90A7311206B5}">
-  <ds:schemaRefs>
-    <ds:schemaRef ds:uri="http://schemas.microsoft.com/office/2006/metadata/properties"/>
-    <ds:schemaRef ds:uri="http://schemas.microsoft.com/office/infopath/2007/PartnerControls"/>
-    <ds:schemaRef ds:uri="6303f13c-72cc-47f0-aeed-d46f93b29717"/>
-    <ds:schemaRef ds:uri="6fbcc8e4-81ed-40b2-9b21-aa98bc8e658d"/>
-  </ds:schemaRefs>
-</ds:datastoreItem>
-</file>
-
-<file path=customXml/itemProps4.xml><?xml version="1.0" encoding="utf-8"?>
 <ds:datastoreItem xmlns:ds="http://schemas.openxmlformats.org/officeDocument/2006/customXml" ds:itemID="{8D82154A-8925-4D70-8E81-8FCE0F18F3BE}">
   <ds:schemaRefs>
     <ds:schemaRef ds:uri="http://schemas.microsoft.com/office/2006/metadata/contentType"/>
@@ -9505,10 +10208,21 @@
 </ds:datastoreItem>
 </file>
 
+<file path=customXml/itemProps4.xml><?xml version="1.0" encoding="utf-8"?>
+<ds:datastoreItem xmlns:ds="http://schemas.openxmlformats.org/officeDocument/2006/customXml" ds:itemID="{9808B4E2-4289-4E8E-B008-90A7311206B5}">
+  <ds:schemaRefs>
+    <ds:schemaRef ds:uri="http://schemas.microsoft.com/office/2006/metadata/properties"/>
+    <ds:schemaRef ds:uri="http://schemas.microsoft.com/office/infopath/2007/PartnerControls"/>
+    <ds:schemaRef ds:uri="6303f13c-72cc-47f0-aeed-d46f93b29717"/>
+    <ds:schemaRef ds:uri="6fbcc8e4-81ed-40b2-9b21-aa98bc8e658d"/>
+  </ds:schemaRefs>
+</ds:datastoreItem>
+</file>
+
 <file path=customXml/itemProps5.xml><?xml version="1.0" encoding="utf-8"?>
-<ds:datastoreItem xmlns:ds="http://schemas.openxmlformats.org/officeDocument/2006/customXml" ds:itemID="{39A65323-01AA-47E8-8448-C5C7A000691D}">
+<ds:datastoreItem xmlns:ds="http://schemas.openxmlformats.org/officeDocument/2006/customXml" ds:itemID="{308B3A6F-517D-402D-9A9B-F8F60567BA9F}">
   <ds:schemaRefs>
-    <ds:schemaRef ds:uri="http://schemas.microsoft.com/sharepoint/v3/contenttype/forms"/>
+    <ds:schemaRef ds:uri="http://schemas.openxmlformats.org/officeDocument/2006/bibliography"/>
   </ds:schemaRefs>
 </ds:datastoreItem>
 </file>

</xml_diff>

<commit_message>
Trimmed down limitations section and minor tweaks to key findings.
</commit_message>
<xml_diff>
--- a/NHP Report Template_SBR_casestudy.docx
+++ b/NHP Report Template_SBR_casestudy.docx
@@ -168,7 +168,6 @@
                               <w:calendar w:val="gregorian"/>
                             </w:date>
                           </w:sdtPr>
-                          <w:sdtEndPr/>
                           <w:sdtContent>
                             <w:p>
                               <w:pPr>
@@ -1074,7 +1073,6 @@
                           <w:dataBinding w:prefixMappings="xmlns:ns0='http://schemas.openxmlformats.org/officeDocument/2006/extended-properties' " w:xpath="/ns0:Properties[1]/ns0:Company[1]" w:storeItemID="{6668398D-A668-4E3E-A5EB-62B293D839F1}"/>
                           <w:text/>
                         </w:sdtPr>
-                        <w:sdtEndPr/>
                         <w:sdtContent>
                           <w:r>
                             <w:rPr>
@@ -1121,7 +1119,6 @@
                           <w:dataBinding w:prefixMappings="xmlns:ns0='http://schemas.microsoft.com/office/2006/coverPageProps' " w:xpath="/ns0:CoverPageProperties[1]/ns0:CompanyAddress[1]" w:storeItemID="{55AF091B-3C7A-41E3-B477-F2FDAA23CFDA}"/>
                           <w:text/>
                         </w:sdtPr>
-                        <w:sdtEndPr/>
                         <w:sdtContent>
                           <w:r>
                             <w:rPr>
@@ -1353,7 +1350,6 @@
                         <w:dataBinding w:prefixMappings="xmlns:ns0='http://purl.org/dc/elements/1.1/' xmlns:ns1='http://schemas.openxmlformats.org/package/2006/metadata/core-properties' " w:xpath="/ns1:coreProperties[1]/ns0:subject[1]" w:storeItemID="{6C3C8BC8-F283-45AE-878A-BAB7291924A1}"/>
                         <w:text/>
                       </w:sdtPr>
-                      <w:sdtEndPr/>
                       <w:sdtContent>
                         <w:p>
                           <w:pPr>
@@ -1417,7 +1413,6 @@
                         <w:dataBinding w:prefixMappings="xmlns:ns0='http://purl.org/dc/elements/1.1/' xmlns:ns1='http://schemas.openxmlformats.org/package/2006/metadata/core-properties' " w:xpath="/ns1:coreProperties[1]/ns0:creator[1]" w:storeItemID="{6C3C8BC8-F283-45AE-878A-BAB7291924A1}"/>
                         <w:text/>
                       </w:sdtPr>
-                      <w:sdtEndPr/>
                       <w:sdtContent>
                         <w:p>
                           <w:pPr>
@@ -1661,25 +1656,7 @@
           <w:sz w:val="24"/>
           <w:szCs w:val="24"/>
         </w:rPr>
-        <w:t xml:space="preserve">., 2018; van de </w:t>
-      </w:r>
-      <w:proofErr w:type="spellStart"/>
-      <w:r>
-        <w:rPr>
-          <w:rFonts w:ascii="Arial" w:hAnsi="Arial" w:cs="Arial"/>
-          <w:sz w:val="24"/>
-          <w:szCs w:val="24"/>
-        </w:rPr>
-        <w:t>Glind</w:t>
-      </w:r>
-      <w:proofErr w:type="spellEnd"/>
-      <w:r>
-        <w:rPr>
-          <w:rFonts w:ascii="Arial" w:hAnsi="Arial" w:cs="Arial"/>
-          <w:sz w:val="24"/>
-          <w:szCs w:val="24"/>
-        </w:rPr>
-        <w:t xml:space="preserve"> </w:t>
+        <w:t xml:space="preserve">., 2018; van de Glind </w:t>
       </w:r>
       <w:r>
         <w:rPr>
@@ -1791,25 +1768,7 @@
           <w:sz w:val="24"/>
           <w:szCs w:val="24"/>
         </w:rPr>
-        <w:t xml:space="preserve"> </w:t>
-      </w:r>
-      <w:proofErr w:type="gramStart"/>
-      <w:r>
-        <w:rPr>
-          <w:rFonts w:ascii="Arial" w:hAnsi="Arial" w:cs="Arial"/>
-          <w:sz w:val="24"/>
-          <w:szCs w:val="24"/>
-        </w:rPr>
-        <w:t>In order to</w:t>
-      </w:r>
-      <w:proofErr w:type="gramEnd"/>
-      <w:r>
-        <w:rPr>
-          <w:rFonts w:ascii="Arial" w:hAnsi="Arial" w:cs="Arial"/>
-          <w:sz w:val="24"/>
-          <w:szCs w:val="24"/>
-        </w:rPr>
-        <w:t xml:space="preserve"> do so we identified 7 hospital sites acting as ‘natural experiments’ across England between 2010 and 2022.</w:t>
+        <w:t xml:space="preserve"> In order to do so we identified 7 hospital sites acting as ‘natural experiments’ across England between 2010 and 2022.</w:t>
       </w:r>
     </w:p>
     <w:p>
@@ -2270,7 +2229,55 @@
           <w:sz w:val="24"/>
           <w:szCs w:val="24"/>
         </w:rPr>
-        <w:t xml:space="preserve">The impact of switching to single occupancy rooms in hospital is highly variable both within indicator measures and between hospitals. We find no evidence to support a significant increase in productivity or efficiency in single room hospitals. We also find </w:t>
+        <w:t xml:space="preserve">The impact of switching to single occupancy rooms in hospital is highly variable both within indicator measures and between hospitals. We find no </w:t>
+      </w:r>
+      <w:r>
+        <w:rPr>
+          <w:rFonts w:ascii="Arial" w:hAnsi="Arial" w:cs="Arial"/>
+          <w:sz w:val="24"/>
+          <w:szCs w:val="24"/>
+        </w:rPr>
+        <w:t xml:space="preserve">clear </w:t>
+      </w:r>
+      <w:r>
+        <w:rPr>
+          <w:rFonts w:ascii="Arial" w:hAnsi="Arial" w:cs="Arial"/>
+          <w:sz w:val="24"/>
+          <w:szCs w:val="24"/>
+        </w:rPr>
+        <w:t xml:space="preserve">evidence to support a significant increase in productivity or efficiency in </w:t>
+      </w:r>
+      <w:r>
+        <w:rPr>
+          <w:rFonts w:ascii="Arial" w:hAnsi="Arial" w:cs="Arial"/>
+          <w:sz w:val="24"/>
+          <w:szCs w:val="24"/>
+        </w:rPr>
+        <w:t>single-room</w:t>
+      </w:r>
+      <w:r>
+        <w:rPr>
+          <w:rFonts w:ascii="Arial" w:hAnsi="Arial" w:cs="Arial"/>
+          <w:sz w:val="24"/>
+          <w:szCs w:val="24"/>
+        </w:rPr>
+        <w:t xml:space="preserve"> hospitals</w:t>
+      </w:r>
+      <w:r>
+        <w:rPr>
+          <w:rFonts w:ascii="Arial" w:hAnsi="Arial" w:cs="Arial"/>
+          <w:sz w:val="24"/>
+          <w:szCs w:val="24"/>
+        </w:rPr>
+        <w:t xml:space="preserve"> though results tend towards the positive</w:t>
+      </w:r>
+      <w:r>
+        <w:rPr>
+          <w:rFonts w:ascii="Arial" w:hAnsi="Arial" w:cs="Arial"/>
+          <w:sz w:val="24"/>
+          <w:szCs w:val="24"/>
+        </w:rPr>
+        <w:t xml:space="preserve">. We also find </w:t>
       </w:r>
       <w:r>
         <w:rPr>
@@ -2294,7 +2301,48 @@
           <w:sz w:val="24"/>
           <w:szCs w:val="24"/>
         </w:rPr>
-        <w:t>evidence to indicate a negative impact on patient safety, or to support a reduction in hospital acquired infections. Our results do suggest that single</w:t>
+        <w:t xml:space="preserve">evidence to indicate a negative impact on patient safety </w:t>
+      </w:r>
+      <w:r>
+        <w:rPr>
+          <w:rFonts w:ascii="Arial" w:hAnsi="Arial" w:cs="Arial"/>
+          <w:sz w:val="24"/>
+          <w:szCs w:val="24"/>
+        </w:rPr>
+        <w:t xml:space="preserve">(which could be seen as a favourable finding) </w:t>
+      </w:r>
+      <w:r>
+        <w:rPr>
+          <w:rFonts w:ascii="Arial" w:hAnsi="Arial" w:cs="Arial"/>
+          <w:sz w:val="24"/>
+          <w:szCs w:val="24"/>
+        </w:rPr>
+        <w:t xml:space="preserve">or to support a reduction in </w:t>
+      </w:r>
+      <w:r>
+        <w:rPr>
+          <w:rFonts w:ascii="Arial" w:hAnsi="Arial" w:cs="Arial"/>
+          <w:sz w:val="24"/>
+          <w:szCs w:val="24"/>
+        </w:rPr>
+        <w:t>hospital-acquired</w:t>
+      </w:r>
+      <w:r>
+        <w:rPr>
+          <w:rFonts w:ascii="Arial" w:hAnsi="Arial" w:cs="Arial"/>
+          <w:sz w:val="24"/>
+          <w:szCs w:val="24"/>
+        </w:rPr>
+        <w:t xml:space="preserve"> infections. </w:t>
+      </w:r>
+      <w:r>
+        <w:rPr>
+          <w:rFonts w:ascii="Arial" w:hAnsi="Arial" w:cs="Arial"/>
+          <w:sz w:val="24"/>
+          <w:szCs w:val="24"/>
+        </w:rPr>
+        <w:lastRenderedPageBreak/>
+        <w:t>Our results do suggest that single</w:t>
       </w:r>
       <w:r>
         <w:rPr>
@@ -2310,7 +2358,39 @@
           <w:sz w:val="24"/>
           <w:szCs w:val="24"/>
         </w:rPr>
-        <w:t xml:space="preserve"> rooms may negatively impact staff.</w:t>
+        <w:t xml:space="preserve"> rooms may </w:t>
+      </w:r>
+      <w:r>
+        <w:rPr>
+          <w:rFonts w:ascii="Arial" w:hAnsi="Arial" w:cs="Arial"/>
+          <w:sz w:val="24"/>
+          <w:szCs w:val="24"/>
+        </w:rPr>
+        <w:t>significantly</w:t>
+      </w:r>
+      <w:r>
+        <w:rPr>
+          <w:rFonts w:ascii="Arial" w:hAnsi="Arial" w:cs="Arial"/>
+          <w:sz w:val="24"/>
+          <w:szCs w:val="24"/>
+        </w:rPr>
+        <w:t xml:space="preserve"> impact staff</w:t>
+      </w:r>
+      <w:r>
+        <w:rPr>
+          <w:rFonts w:ascii="Arial" w:hAnsi="Arial" w:cs="Arial"/>
+          <w:sz w:val="24"/>
+          <w:szCs w:val="24"/>
+        </w:rPr>
+        <w:t xml:space="preserve"> wellbeing and productivity</w:t>
+      </w:r>
+      <w:r>
+        <w:rPr>
+          <w:rFonts w:ascii="Arial" w:hAnsi="Arial" w:cs="Arial"/>
+          <w:sz w:val="24"/>
+          <w:szCs w:val="24"/>
+        </w:rPr>
+        <w:t>.</w:t>
       </w:r>
     </w:p>
     <w:p>
@@ -2329,7 +2409,6 @@
           <w:sz w:val="24"/>
           <w:szCs w:val="24"/>
         </w:rPr>
-        <w:lastRenderedPageBreak/>
         <w:t xml:space="preserve">Figure </w:t>
       </w:r>
       <w:r>
@@ -2444,7 +2523,7 @@
           <w:sz w:val="24"/>
           <w:szCs w:val="24"/>
         </w:rPr>
-        <w:t xml:space="preserve">Figure </w:t>
+        <w:t xml:space="preserve">Figure 4. Meta-analyses of the </w:t>
       </w:r>
       <w:r>
         <w:rPr>
@@ -2454,7 +2533,7 @@
           <w:sz w:val="24"/>
           <w:szCs w:val="24"/>
         </w:rPr>
-        <w:t>4</w:t>
+        <w:t>impacts at general acute hospitals (specialist providers were excluded as the</w:t>
       </w:r>
       <w:r>
         <w:rPr>
@@ -2464,7 +2543,7 @@
           <w:sz w:val="24"/>
           <w:szCs w:val="24"/>
         </w:rPr>
-        <w:t xml:space="preserve">. </w:t>
+        <w:t>i</w:t>
       </w:r>
       <w:r>
         <w:rPr>
@@ -2474,7 +2553,7 @@
           <w:sz w:val="24"/>
           <w:szCs w:val="24"/>
         </w:rPr>
-        <w:t xml:space="preserve">Meta-analyses of the </w:t>
+        <w:t>r</w:t>
       </w:r>
       <w:r>
         <w:rPr>
@@ -2484,7 +2563,7 @@
           <w:sz w:val="24"/>
           <w:szCs w:val="24"/>
         </w:rPr>
-        <w:t>impacts at general acute hospitals (specialist providers were excluded as the</w:t>
+        <w:t xml:space="preserve"> results may not be </w:t>
       </w:r>
       <w:r>
         <w:rPr>
@@ -2494,7 +2573,7 @@
           <w:sz w:val="24"/>
           <w:szCs w:val="24"/>
         </w:rPr>
-        <w:t>i</w:t>
+        <w:t>generalisab</w:t>
       </w:r>
       <w:r>
         <w:rPr>
@@ -2504,7 +2583,7 @@
           <w:sz w:val="24"/>
           <w:szCs w:val="24"/>
         </w:rPr>
-        <w:t>r</w:t>
+        <w:t xml:space="preserve">le </w:t>
       </w:r>
       <w:r>
         <w:rPr>
@@ -2514,7 +2593,7 @@
           <w:sz w:val="24"/>
           <w:szCs w:val="24"/>
         </w:rPr>
-        <w:t xml:space="preserve"> results may not be </w:t>
+        <w:t>to</w:t>
       </w:r>
       <w:r>
         <w:rPr>
@@ -2524,36 +2603,6 @@
           <w:sz w:val="24"/>
           <w:szCs w:val="24"/>
         </w:rPr>
-        <w:t>generalisab</w:t>
-      </w:r>
-      <w:r>
-        <w:rPr>
-          <w:rFonts w:ascii="Arial" w:hAnsi="Arial" w:cs="Arial"/>
-          <w:i/>
-          <w:iCs/>
-          <w:sz w:val="24"/>
-          <w:szCs w:val="24"/>
-        </w:rPr>
-        <w:t xml:space="preserve">le </w:t>
-      </w:r>
-      <w:r>
-        <w:rPr>
-          <w:rFonts w:ascii="Arial" w:hAnsi="Arial" w:cs="Arial"/>
-          <w:i/>
-          <w:iCs/>
-          <w:sz w:val="24"/>
-          <w:szCs w:val="24"/>
-        </w:rPr>
-        <w:t>to</w:t>
-      </w:r>
-      <w:r>
-        <w:rPr>
-          <w:rFonts w:ascii="Arial" w:hAnsi="Arial" w:cs="Arial"/>
-          <w:i/>
-          <w:iCs/>
-          <w:sz w:val="24"/>
-          <w:szCs w:val="24"/>
-        </w:rPr>
         <w:t xml:space="preserve"> future general acute hospitals)</w:t>
       </w:r>
     </w:p>
@@ -2573,9 +2622,9 @@
           <w:szCs w:val="24"/>
         </w:rPr>
         <w:drawing>
-          <wp:inline distT="0" distB="0" distL="0" distR="0" wp14:anchorId="1D8FA515" wp14:editId="543870E7">
-            <wp:extent cx="6415286" cy="3202940"/>
-            <wp:effectExtent l="0" t="0" r="5080" b="0"/>
+          <wp:inline distT="0" distB="0" distL="0" distR="0" wp14:anchorId="1D8FA515" wp14:editId="63B60DE1">
+            <wp:extent cx="5791200" cy="2891354"/>
+            <wp:effectExtent l="0" t="0" r="0" b="4445"/>
             <wp:docPr id="855330380" name="Picture 7"/>
             <wp:cNvGraphicFramePr>
               <a:graphicFrameLocks xmlns:a="http://schemas.openxmlformats.org/drawingml/2006/main" noChangeAspect="1"/>
@@ -2605,7 +2654,7 @@
                   <pic:spPr bwMode="auto">
                     <a:xfrm>
                       <a:off x="0" y="0"/>
-                      <a:ext cx="6431570" cy="3211070"/>
+                      <a:ext cx="5813222" cy="2902349"/>
                     </a:xfrm>
                     <a:prstGeom prst="rect">
                       <a:avLst/>
@@ -2623,21 +2672,12 @@
       <w:pPr>
         <w:rPr>
           <w:rFonts w:ascii="Arial" w:hAnsi="Arial" w:cs="Arial"/>
-          <w:sz w:val="24"/>
-          <w:szCs w:val="24"/>
-        </w:rPr>
-      </w:pPr>
-      <w:r>
-        <w:rPr>
-          <w:rFonts w:ascii="Arial" w:hAnsi="Arial" w:cs="Arial"/>
           <w:b/>
           <w:bCs/>
           <w:sz w:val="24"/>
           <w:szCs w:val="24"/>
         </w:rPr>
-        <w:lastRenderedPageBreak/>
-        <w:t xml:space="preserve">Limitations and </w:t>
-      </w:r>
+      </w:pPr>
       <w:r>
         <w:rPr>
           <w:rFonts w:ascii="Arial" w:hAnsi="Arial" w:cs="Arial"/>
@@ -2646,13 +2686,237 @@
           <w:sz w:val="24"/>
           <w:szCs w:val="24"/>
         </w:rPr>
-        <w:t>Discussion:</w:t>
+        <w:lastRenderedPageBreak/>
+        <w:t>Limitations</w:t>
+      </w:r>
+      <w:r>
+        <w:rPr>
+          <w:rFonts w:ascii="Arial" w:hAnsi="Arial" w:cs="Arial"/>
+          <w:b/>
+          <w:bCs/>
+          <w:sz w:val="24"/>
+          <w:szCs w:val="24"/>
+        </w:rPr>
+        <w:t>:</w:t>
       </w:r>
     </w:p>
     <w:p>
       <w:pPr>
         <w:rPr>
           <w:rFonts w:ascii="Arial" w:hAnsi="Arial" w:cs="Arial"/>
+          <w:sz w:val="24"/>
+          <w:szCs w:val="24"/>
+        </w:rPr>
+      </w:pPr>
+      <w:r>
+        <w:rPr>
+          <w:rFonts w:ascii="Arial" w:hAnsi="Arial" w:cs="Arial"/>
+          <w:sz w:val="24"/>
+          <w:szCs w:val="24"/>
+        </w:rPr>
+        <w:t xml:space="preserve">Our analyses rely on historical data collections meaning that some data recording does not go back as far enough to use for all the study hospitals or there are gaps/anomalies in the time series. </w:t>
+      </w:r>
+      <w:r>
+        <w:rPr>
+          <w:rFonts w:ascii="Arial" w:hAnsi="Arial" w:cs="Arial"/>
+          <w:sz w:val="24"/>
+          <w:szCs w:val="24"/>
+        </w:rPr>
+        <w:t>Additional</w:t>
+      </w:r>
+      <w:r>
+        <w:rPr>
+          <w:rFonts w:ascii="Arial" w:hAnsi="Arial" w:cs="Arial"/>
+          <w:sz w:val="24"/>
+          <w:szCs w:val="24"/>
+        </w:rPr>
+        <w:t>ly s</w:t>
+      </w:r>
+      <w:r>
+        <w:rPr>
+          <w:rFonts w:ascii="Arial" w:hAnsi="Arial" w:cs="Arial"/>
+          <w:sz w:val="24"/>
+          <w:szCs w:val="24"/>
+        </w:rPr>
+        <w:t xml:space="preserve">ome data were affected by </w:t>
+      </w:r>
+      <w:r>
+        <w:rPr>
+          <w:rFonts w:ascii="Arial" w:hAnsi="Arial" w:cs="Arial"/>
+          <w:sz w:val="24"/>
+          <w:szCs w:val="24"/>
+        </w:rPr>
+        <w:t xml:space="preserve">the timing of the </w:t>
+      </w:r>
+      <w:r>
+        <w:rPr>
+          <w:rFonts w:ascii="Arial" w:hAnsi="Arial" w:cs="Arial"/>
+          <w:sz w:val="24"/>
+          <w:szCs w:val="24"/>
+        </w:rPr>
+        <w:t>COVID-19</w:t>
+      </w:r>
+      <w:r>
+        <w:rPr>
+          <w:rFonts w:ascii="Arial" w:hAnsi="Arial" w:cs="Arial"/>
+          <w:sz w:val="24"/>
+          <w:szCs w:val="24"/>
+        </w:rPr>
+        <w:t xml:space="preserve"> pandemic. </w:t>
+      </w:r>
+      <w:r>
+        <w:rPr>
+          <w:rFonts w:ascii="Arial" w:hAnsi="Arial" w:cs="Arial"/>
+          <w:sz w:val="24"/>
+          <w:szCs w:val="24"/>
+        </w:rPr>
+        <w:t xml:space="preserve">This means </w:t>
+      </w:r>
+      <w:r>
+        <w:rPr>
+          <w:rFonts w:ascii="Arial" w:hAnsi="Arial" w:cs="Arial"/>
+          <w:sz w:val="24"/>
+          <w:szCs w:val="24"/>
+        </w:rPr>
+        <w:t xml:space="preserve">that </w:t>
+      </w:r>
+      <w:r>
+        <w:rPr>
+          <w:rFonts w:ascii="Arial" w:hAnsi="Arial" w:cs="Arial"/>
+          <w:sz w:val="24"/>
+          <w:szCs w:val="24"/>
+        </w:rPr>
+        <w:t>for some measures we have limited data which may impact the reliability of our findings.</w:t>
+      </w:r>
+    </w:p>
+    <w:p>
+      <w:pPr>
+        <w:rPr>
+          <w:rFonts w:ascii="Arial" w:hAnsi="Arial" w:cs="Arial"/>
+          <w:sz w:val="24"/>
+          <w:szCs w:val="24"/>
+        </w:rPr>
+      </w:pPr>
+      <w:r>
+        <w:rPr>
+          <w:rFonts w:ascii="Arial" w:hAnsi="Arial" w:cs="Arial"/>
+          <w:sz w:val="24"/>
+          <w:szCs w:val="24"/>
+        </w:rPr>
+        <w:t>The number of sites in the control pool w</w:t>
+      </w:r>
+      <w:r>
+        <w:rPr>
+          <w:rFonts w:ascii="Arial" w:hAnsi="Arial" w:cs="Arial"/>
+          <w:sz w:val="24"/>
+          <w:szCs w:val="24"/>
+        </w:rPr>
+        <w:t>ere also</w:t>
+      </w:r>
+      <w:r>
+        <w:rPr>
+          <w:rFonts w:ascii="Arial" w:hAnsi="Arial" w:cs="Arial"/>
+          <w:sz w:val="24"/>
+          <w:szCs w:val="24"/>
+        </w:rPr>
+        <w:t xml:space="preserve"> very limited for </w:t>
+      </w:r>
+      <w:r>
+        <w:rPr>
+          <w:rFonts w:ascii="Arial" w:hAnsi="Arial" w:cs="Arial"/>
+          <w:sz w:val="24"/>
+          <w:szCs w:val="24"/>
+        </w:rPr>
+        <w:t>two of the specialist centres</w:t>
+      </w:r>
+      <w:r>
+        <w:rPr>
+          <w:rFonts w:ascii="Arial" w:hAnsi="Arial" w:cs="Arial"/>
+          <w:sz w:val="24"/>
+          <w:szCs w:val="24"/>
+        </w:rPr>
+        <w:t xml:space="preserve">, which may have impacted the quality of the model fit and reliability of the outcomes. Furthermore, our meta-analyses are limited due having only 4 general acute hospital study sites. </w:t>
+      </w:r>
+    </w:p>
+    <w:p>
+      <w:pPr>
+        <w:rPr>
+          <w:rFonts w:ascii="Arial" w:hAnsi="Arial" w:cs="Arial"/>
+          <w:sz w:val="24"/>
+          <w:szCs w:val="24"/>
+        </w:rPr>
+      </w:pPr>
+      <w:r>
+        <w:rPr>
+          <w:rFonts w:ascii="Arial" w:hAnsi="Arial" w:cs="Arial"/>
+          <w:sz w:val="24"/>
+          <w:szCs w:val="24"/>
+        </w:rPr>
+        <w:t xml:space="preserve">Some variables are only available at provider level, so where providers have more than one site any change that may occur following a switch to single bedrooms at one site will be diluted by a lack of change at the </w:t>
+      </w:r>
+      <w:r>
+        <w:rPr>
+          <w:rFonts w:ascii="Arial" w:hAnsi="Arial" w:cs="Arial"/>
+          <w:sz w:val="24"/>
+          <w:szCs w:val="24"/>
+        </w:rPr>
+        <w:t>providers'</w:t>
+      </w:r>
+      <w:r>
+        <w:rPr>
+          <w:rFonts w:ascii="Arial" w:hAnsi="Arial" w:cs="Arial"/>
+          <w:sz w:val="24"/>
+          <w:szCs w:val="24"/>
+        </w:rPr>
+        <w:t xml:space="preserve"> other sites. Some measures are recorded quarterly (bed occupancy) or annually (cleaning costs and staff survey), so we have less data points with which to fit our models and assess outcomes.</w:t>
+      </w:r>
+    </w:p>
+    <w:p>
+      <w:pPr>
+        <w:rPr>
+          <w:rFonts w:ascii="Arial" w:hAnsi="Arial" w:cs="Arial"/>
+          <w:sz w:val="24"/>
+          <w:szCs w:val="24"/>
+        </w:rPr>
+      </w:pPr>
+      <w:r>
+        <w:rPr>
+          <w:rFonts w:ascii="Arial" w:hAnsi="Arial" w:cs="Arial"/>
+          <w:sz w:val="24"/>
+          <w:szCs w:val="24"/>
+        </w:rPr>
+        <w:t xml:space="preserve">To assess some of the impacts of interest we have needed to use a proxy measure, e.g. staff sickness and staff turnover as a proxy for staff experience and median waiting time as a proxy for hospital productivity. </w:t>
+      </w:r>
+    </w:p>
+    <w:p>
+      <w:pPr>
+        <w:rPr>
+          <w:rFonts w:ascii="Arial" w:hAnsi="Arial" w:cs="Arial"/>
+          <w:sz w:val="24"/>
+          <w:szCs w:val="24"/>
+        </w:rPr>
+      </w:pPr>
+      <w:r>
+        <w:rPr>
+          <w:rFonts w:ascii="Arial" w:hAnsi="Arial" w:cs="Arial"/>
+          <w:sz w:val="24"/>
+          <w:szCs w:val="24"/>
+        </w:rPr>
+        <w:t>When the sites switched to single bedrooms there are likely to have been other changes to how services operate and at multi-site providers there may also have been changes to what services are provided at which sites, hence there are likely to be confounding factors that influence our results.</w:t>
+      </w:r>
+      <w:r>
+        <w:rPr>
+          <w:rFonts w:ascii="Arial" w:hAnsi="Arial" w:cs="Arial"/>
+          <w:sz w:val="24"/>
+          <w:szCs w:val="24"/>
+        </w:rPr>
+        <w:t xml:space="preserve"> </w:t>
+      </w:r>
+    </w:p>
+    <w:p>
+      <w:pPr>
+        <w:rPr>
+          <w:rFonts w:ascii="Arial" w:hAnsi="Arial" w:cs="Arial"/>
           <w:b/>
           <w:bCs/>
           <w:sz w:val="24"/>
@@ -2667,205 +2931,9 @@
           <w:sz w:val="24"/>
           <w:szCs w:val="24"/>
         </w:rPr>
-        <w:t>Limitations</w:t>
-      </w:r>
-    </w:p>
-    <w:p>
-      <w:pPr>
-        <w:rPr>
-          <w:rFonts w:ascii="Arial" w:hAnsi="Arial" w:cs="Arial"/>
-          <w:sz w:val="24"/>
-          <w:szCs w:val="24"/>
-        </w:rPr>
-      </w:pPr>
-      <w:r>
-        <w:rPr>
-          <w:rFonts w:ascii="Arial" w:hAnsi="Arial" w:cs="Arial"/>
-          <w:sz w:val="24"/>
-          <w:szCs w:val="24"/>
-        </w:rPr>
-        <w:t xml:space="preserve">Our analyses rely on historical data collections meaning that some data recording does not go back as far enough to use for all the study hospitals (e.g. reporting of </w:t>
-      </w:r>
-      <w:proofErr w:type="spellStart"/>
-      <w:proofErr w:type="gramStart"/>
-      <w:r>
-        <w:rPr>
-          <w:rFonts w:ascii="Arial" w:hAnsi="Arial" w:cs="Arial"/>
-          <w:sz w:val="24"/>
-          <w:szCs w:val="24"/>
-        </w:rPr>
-        <w:t>c.difficile</w:t>
-      </w:r>
-      <w:proofErr w:type="spellEnd"/>
-      <w:proofErr w:type="gramEnd"/>
-      <w:r>
-        <w:rPr>
-          <w:rFonts w:ascii="Arial" w:hAnsi="Arial" w:cs="Arial"/>
-          <w:sz w:val="24"/>
-          <w:szCs w:val="24"/>
-        </w:rPr>
-        <w:t xml:space="preserve"> infections) or there are gaps/anomalies in the time series. </w:t>
-      </w:r>
-      <w:r>
-        <w:rPr>
-          <w:rFonts w:ascii="Arial" w:hAnsi="Arial" w:cs="Arial"/>
-          <w:sz w:val="24"/>
-          <w:szCs w:val="24"/>
-        </w:rPr>
-        <w:t xml:space="preserve">Indeed, it was </w:t>
-      </w:r>
-      <w:r>
-        <w:rPr>
-          <w:rFonts w:ascii="Arial" w:hAnsi="Arial" w:cs="Arial"/>
-          <w:sz w:val="24"/>
-          <w:szCs w:val="24"/>
-        </w:rPr>
-        <w:t xml:space="preserve">difficult to determine the exact percentage of single-bed rooms in the </w:t>
-      </w:r>
-      <w:r>
-        <w:rPr>
-          <w:rFonts w:ascii="Arial" w:hAnsi="Arial" w:cs="Arial"/>
-          <w:sz w:val="24"/>
-          <w:szCs w:val="24"/>
-        </w:rPr>
-        <w:t xml:space="preserve">study </w:t>
-      </w:r>
-      <w:r>
-        <w:rPr>
-          <w:rFonts w:ascii="Arial" w:hAnsi="Arial" w:cs="Arial"/>
-          <w:sz w:val="24"/>
-          <w:szCs w:val="24"/>
-        </w:rPr>
-        <w:t>hospitals with the data available.</w:t>
-      </w:r>
-      <w:r>
-        <w:rPr>
-          <w:rFonts w:ascii="Arial" w:hAnsi="Arial" w:cs="Arial"/>
-          <w:sz w:val="24"/>
-          <w:szCs w:val="24"/>
-        </w:rPr>
-        <w:t xml:space="preserve"> </w:t>
-      </w:r>
-      <w:r>
-        <w:rPr>
-          <w:rFonts w:ascii="Arial" w:hAnsi="Arial" w:cs="Arial"/>
-          <w:sz w:val="24"/>
-          <w:szCs w:val="24"/>
-        </w:rPr>
-        <w:t xml:space="preserve">There are also a few cases where we were not able to fit appropriate causal impact models. Some data were affected by COVID-19; causal impact analysis will have accounted for COVID-19 effects where the magnitude was similar between control and study sites, but when the magnitude of the COVID-19 effects </w:t>
-      </w:r>
-      <w:proofErr w:type="gramStart"/>
-      <w:r>
-        <w:rPr>
-          <w:rFonts w:ascii="Arial" w:hAnsi="Arial" w:cs="Arial"/>
-          <w:sz w:val="24"/>
-          <w:szCs w:val="24"/>
-        </w:rPr>
-        <w:t>were</w:t>
-      </w:r>
-      <w:proofErr w:type="gramEnd"/>
-      <w:r>
-        <w:rPr>
-          <w:rFonts w:ascii="Arial" w:hAnsi="Arial" w:cs="Arial"/>
-          <w:sz w:val="24"/>
-          <w:szCs w:val="24"/>
-        </w:rPr>
-        <w:t xml:space="preserve"> greater at the study site compared to their control sites</w:t>
-      </w:r>
-      <w:r>
-        <w:rPr>
-          <w:rFonts w:ascii="Arial" w:hAnsi="Arial" w:cs="Arial"/>
-          <w:sz w:val="24"/>
-          <w:szCs w:val="24"/>
-        </w:rPr>
-        <w:t xml:space="preserve"> </w:t>
-      </w:r>
-      <w:r>
-        <w:rPr>
-          <w:rFonts w:ascii="Arial" w:hAnsi="Arial" w:cs="Arial"/>
-          <w:sz w:val="24"/>
-          <w:szCs w:val="24"/>
-        </w:rPr>
-        <w:t xml:space="preserve">some results have had to be excluded. This means for some measures we have limited data which may impact the reliability of our findings. The number of sites in the control pool was very limited for </w:t>
-      </w:r>
-      <w:r>
-        <w:rPr>
-          <w:rFonts w:ascii="Arial" w:hAnsi="Arial" w:cs="Arial"/>
-          <w:sz w:val="24"/>
-          <w:szCs w:val="24"/>
-        </w:rPr>
-        <w:t>two of the specialist centres</w:t>
-      </w:r>
-      <w:r>
-        <w:rPr>
-          <w:rFonts w:ascii="Arial" w:hAnsi="Arial" w:cs="Arial"/>
-          <w:sz w:val="24"/>
-          <w:szCs w:val="24"/>
-        </w:rPr>
-        <w:t xml:space="preserve">, which may have impacted the quality of the model fit and reliability of the outcomes. Furthermore, our meta-analyses are limited due having only 4 general acute hospital study sites. </w:t>
-      </w:r>
-    </w:p>
-    <w:p>
-      <w:pPr>
-        <w:rPr>
-          <w:rFonts w:ascii="Arial" w:hAnsi="Arial" w:cs="Arial"/>
-          <w:sz w:val="24"/>
-          <w:szCs w:val="24"/>
-        </w:rPr>
-      </w:pPr>
-      <w:r>
-        <w:rPr>
-          <w:rFonts w:ascii="Arial" w:hAnsi="Arial" w:cs="Arial"/>
-          <w:sz w:val="24"/>
-          <w:szCs w:val="24"/>
-        </w:rPr>
-        <w:t>Some variables are only available at provider level, so where providers have more than one site any change that may occur following a switch to single bedrooms at one site will be diluted by a lack of change at the providers other sites. Some measures are recorded quarterly (bed occupancy) or annually (cleaning costs and staff survey), so we have less data points with which to fit our models and assess outcomes, and less temporal specificity to detect changes.</w:t>
-      </w:r>
-    </w:p>
-    <w:p>
-      <w:pPr>
-        <w:rPr>
-          <w:rFonts w:ascii="Arial" w:hAnsi="Arial" w:cs="Arial"/>
-          <w:sz w:val="24"/>
-          <w:szCs w:val="24"/>
-        </w:rPr>
-      </w:pPr>
-      <w:r>
-        <w:rPr>
-          <w:rFonts w:ascii="Arial" w:hAnsi="Arial" w:cs="Arial"/>
-          <w:sz w:val="24"/>
-          <w:szCs w:val="24"/>
-        </w:rPr>
-        <w:t xml:space="preserve">To assess some of the impacts of interest we have needed to use a proxy measure, e.g. staff sickness and staff turnover as a proxy for staff experience and median waiting time as a proxy for hospital productivity. </w:t>
-      </w:r>
-    </w:p>
-    <w:p>
-      <w:pPr>
-        <w:rPr>
-          <w:rFonts w:ascii="Arial" w:hAnsi="Arial" w:cs="Arial"/>
-          <w:sz w:val="24"/>
-          <w:szCs w:val="24"/>
-        </w:rPr>
-      </w:pPr>
-      <w:r>
-        <w:rPr>
-          <w:rFonts w:ascii="Arial" w:hAnsi="Arial" w:cs="Arial"/>
-          <w:sz w:val="24"/>
-          <w:szCs w:val="24"/>
-        </w:rPr>
-        <w:t>When the sites switched to single bedrooms there are likely to have been other changes to how services operate and at multi-site providers there may also have been changes to what services are provided at which sites, hence there are likely to be confounding factors that influence our results.</w:t>
-      </w:r>
-      <w:r>
-        <w:rPr>
-          <w:rFonts w:ascii="Arial" w:hAnsi="Arial" w:cs="Arial"/>
-          <w:sz w:val="24"/>
-          <w:szCs w:val="24"/>
-        </w:rPr>
-        <w:t xml:space="preserve"> </w:t>
-      </w:r>
-    </w:p>
-    <w:p>
-      <w:pPr>
+        <w:t>Discussion</w:t>
+      </w:r>
+      <w:r>
         <w:rPr>
           <w:rFonts w:ascii="Arial" w:hAnsi="Arial" w:cs="Arial"/>
           <w:b/>
@@ -2873,16 +2941,7 @@
           <w:sz w:val="24"/>
           <w:szCs w:val="24"/>
         </w:rPr>
-      </w:pPr>
-      <w:r>
-        <w:rPr>
-          <w:rFonts w:ascii="Arial" w:hAnsi="Arial" w:cs="Arial"/>
-          <w:b/>
-          <w:bCs/>
-          <w:sz w:val="24"/>
-          <w:szCs w:val="24"/>
-        </w:rPr>
-        <w:t>Discussion</w:t>
+        <w:t>:</w:t>
       </w:r>
     </w:p>
     <w:p>
@@ -3019,7 +3078,6 @@
           <w:sz w:val="24"/>
           <w:szCs w:val="24"/>
         </w:rPr>
-        <w:lastRenderedPageBreak/>
         <w:t xml:space="preserve">quick-response patient and staff </w:t>
       </w:r>
       <w:r>
@@ -3118,7 +3176,9 @@
           <w:szCs w:val="24"/>
         </w:rPr>
       </w:pPr>
-      <w:r>
+    </w:p>
+    <w:p>
+      <w:pPr>
         <w:rPr>
           <w:rFonts w:ascii="Arial" w:hAnsi="Arial" w:cs="Arial"/>
           <w:b/>
@@ -3126,7 +3186,27 @@
           <w:sz w:val="24"/>
           <w:szCs w:val="24"/>
         </w:rPr>
+      </w:pPr>
+      <w:r>
+        <w:rPr>
+          <w:rFonts w:ascii="Arial" w:hAnsi="Arial" w:cs="Arial"/>
+          <w:b/>
+          <w:bCs/>
+          <w:sz w:val="24"/>
+          <w:szCs w:val="24"/>
+        </w:rPr>
+        <w:lastRenderedPageBreak/>
         <w:t>References</w:t>
+      </w:r>
+      <w:r>
+        <w:rPr>
+          <w:rFonts w:ascii="Arial" w:hAnsi="Arial" w:cs="Arial"/>
+          <w:b/>
+          <w:bCs/>
+          <w:sz w:val="24"/>
+          <w:szCs w:val="24"/>
+        </w:rPr>
+        <w:t>:</w:t>
       </w:r>
     </w:p>
     <w:p>
@@ -3143,43 +3223,7 @@
           <w:sz w:val="24"/>
           <w:szCs w:val="24"/>
         </w:rPr>
-        <w:t>Bertuzzi A, Martin A, Clarke N et al. Clinical, humanistic and economic outcomes, including experiencing of patient safety events, associated with admitting patients to single rooms compared with shared accommodation for acute hospital admissions: a systematic review and narrative synthesis. BMJ Open. 2023 May 5;13(5</w:t>
-      </w:r>
-      <w:proofErr w:type="gramStart"/>
-      <w:r>
-        <w:rPr>
-          <w:rFonts w:ascii="Arial" w:hAnsi="Arial" w:cs="Arial"/>
-          <w:sz w:val="24"/>
-          <w:szCs w:val="24"/>
-        </w:rPr>
-        <w:t>):e</w:t>
-      </w:r>
-      <w:proofErr w:type="gramEnd"/>
-      <w:r>
-        <w:rPr>
-          <w:rFonts w:ascii="Arial" w:hAnsi="Arial" w:cs="Arial"/>
-          <w:sz w:val="24"/>
-          <w:szCs w:val="24"/>
-        </w:rPr>
-        <w:t xml:space="preserve">068932. </w:t>
-      </w:r>
-      <w:proofErr w:type="spellStart"/>
-      <w:r>
-        <w:rPr>
-          <w:rFonts w:ascii="Arial" w:hAnsi="Arial" w:cs="Arial"/>
-          <w:sz w:val="24"/>
-          <w:szCs w:val="24"/>
-        </w:rPr>
-        <w:t>doi</w:t>
-      </w:r>
-      <w:proofErr w:type="spellEnd"/>
-      <w:r>
-        <w:rPr>
-          <w:rFonts w:ascii="Arial" w:hAnsi="Arial" w:cs="Arial"/>
-          <w:sz w:val="24"/>
-          <w:szCs w:val="24"/>
-        </w:rPr>
-        <w:t>: 10.1136/bmjopen-2022-068932.</w:t>
+        <w:t>Bertuzzi A, Martin A, Clarke N et al. Clinical, humanistic and economic outcomes, including experiencing of patient safety events, associated with admitting patients to single rooms compared with shared accommodation for acute hospital admissions: a systematic review and narrative synthesis. BMJ Open. 2023 May 5;13(5):e068932. doi: 10.1136/bmjopen-2022-068932.</w:t>
       </w:r>
     </w:p>
     <w:p>
@@ -3213,25 +3257,7 @@
           <w:sz w:val="24"/>
           <w:szCs w:val="24"/>
         </w:rPr>
-        <w:t xml:space="preserve">Taylor E, Card AJ, Piatkowski M. Single-Occupancy Patient Rooms: A Systematic Review of the Literature Since 2006. HERD. 2018 Jan;11(1):85-100. </w:t>
-      </w:r>
-      <w:proofErr w:type="spellStart"/>
-      <w:r>
-        <w:rPr>
-          <w:rFonts w:ascii="Arial" w:hAnsi="Arial" w:cs="Arial"/>
-          <w:sz w:val="24"/>
-          <w:szCs w:val="24"/>
-        </w:rPr>
-        <w:t>doi</w:t>
-      </w:r>
-      <w:proofErr w:type="spellEnd"/>
-      <w:r>
-        <w:rPr>
-          <w:rFonts w:ascii="Arial" w:hAnsi="Arial" w:cs="Arial"/>
-          <w:sz w:val="24"/>
-          <w:szCs w:val="24"/>
-        </w:rPr>
-        <w:t>: 10.1177/1937586718755110.</w:t>
+        <w:t>Taylor E, Card AJ, Piatkowski M. Single-Occupancy Patient Rooms: A Systematic Review of the Literature Since 2006. HERD. 2018 Jan;11(1):85-100. doi: 10.1177/1937586718755110.</w:t>
       </w:r>
     </w:p>
     <w:p>
@@ -3248,61 +3274,7 @@
           <w:sz w:val="24"/>
           <w:szCs w:val="24"/>
         </w:rPr>
-        <w:t xml:space="preserve">van de </w:t>
-      </w:r>
-      <w:proofErr w:type="spellStart"/>
-      <w:r>
-        <w:rPr>
-          <w:rFonts w:ascii="Arial" w:hAnsi="Arial" w:cs="Arial"/>
-          <w:sz w:val="24"/>
-          <w:szCs w:val="24"/>
-        </w:rPr>
-        <w:t>Glind</w:t>
-      </w:r>
-      <w:proofErr w:type="spellEnd"/>
-      <w:r>
-        <w:rPr>
-          <w:rFonts w:ascii="Arial" w:hAnsi="Arial" w:cs="Arial"/>
-          <w:sz w:val="24"/>
-          <w:szCs w:val="24"/>
-        </w:rPr>
-        <w:t xml:space="preserve"> I, de Roode S, </w:t>
-      </w:r>
-      <w:proofErr w:type="spellStart"/>
-      <w:r>
-        <w:rPr>
-          <w:rFonts w:ascii="Arial" w:hAnsi="Arial" w:cs="Arial"/>
-          <w:sz w:val="24"/>
-          <w:szCs w:val="24"/>
-        </w:rPr>
-        <w:t>Goossensen</w:t>
-      </w:r>
-      <w:proofErr w:type="spellEnd"/>
-      <w:r>
-        <w:rPr>
-          <w:rFonts w:ascii="Arial" w:hAnsi="Arial" w:cs="Arial"/>
-          <w:sz w:val="24"/>
-          <w:szCs w:val="24"/>
-        </w:rPr>
-        <w:t xml:space="preserve"> A. Do patients in hospitals benefit from single rooms? A literature review. Health Policy. 2007 Dec;84(2-3):153-61. </w:t>
-      </w:r>
-      <w:proofErr w:type="spellStart"/>
-      <w:r>
-        <w:rPr>
-          <w:rFonts w:ascii="Arial" w:hAnsi="Arial" w:cs="Arial"/>
-          <w:sz w:val="24"/>
-          <w:szCs w:val="24"/>
-        </w:rPr>
-        <w:t>doi</w:t>
-      </w:r>
-      <w:proofErr w:type="spellEnd"/>
-      <w:r>
-        <w:rPr>
-          <w:rFonts w:ascii="Arial" w:hAnsi="Arial" w:cs="Arial"/>
-          <w:sz w:val="24"/>
-          <w:szCs w:val="24"/>
-        </w:rPr>
-        <w:t>: 10.1016/j.healthpol.2007.06.002.</w:t>
+        <w:t>van de Glind I, de Roode S, Goossensen A. Do patients in hospitals benefit from single rooms? A literature review. Health Policy. 2007 Dec;84(2-3):153-61. doi: 10.1016/j.healthpol.2007.06.002.</w:t>
       </w:r>
     </w:p>
     <w:p>
@@ -3319,43 +3291,7 @@
           <w:sz w:val="24"/>
           <w:szCs w:val="24"/>
         </w:rPr>
-        <w:t xml:space="preserve">Voigt J, Mosier M, </w:t>
-      </w:r>
-      <w:proofErr w:type="spellStart"/>
-      <w:r>
-        <w:rPr>
-          <w:rFonts w:ascii="Arial" w:hAnsi="Arial" w:cs="Arial"/>
-          <w:sz w:val="24"/>
-          <w:szCs w:val="24"/>
-        </w:rPr>
-        <w:t>Darouiche</w:t>
-      </w:r>
-      <w:proofErr w:type="spellEnd"/>
-      <w:r>
-        <w:rPr>
-          <w:rFonts w:ascii="Arial" w:hAnsi="Arial" w:cs="Arial"/>
-          <w:sz w:val="24"/>
-          <w:szCs w:val="24"/>
-        </w:rPr>
-        <w:t xml:space="preserve"> R. Private Rooms in Low Acuity Settings: A Systematic Review of the Literature. HERD. 2018 Jan;11(1):57-74. </w:t>
-      </w:r>
-      <w:proofErr w:type="spellStart"/>
-      <w:r>
-        <w:rPr>
-          <w:rFonts w:ascii="Arial" w:hAnsi="Arial" w:cs="Arial"/>
-          <w:sz w:val="24"/>
-          <w:szCs w:val="24"/>
-        </w:rPr>
-        <w:t>doi</w:t>
-      </w:r>
-      <w:proofErr w:type="spellEnd"/>
-      <w:r>
-        <w:rPr>
-          <w:rFonts w:ascii="Arial" w:hAnsi="Arial" w:cs="Arial"/>
-          <w:sz w:val="24"/>
-          <w:szCs w:val="24"/>
-        </w:rPr>
-        <w:t xml:space="preserve">: 10.1177/1937586717702597. </w:t>
+        <w:t xml:space="preserve">Voigt J, Mosier M, Darouiche R. Private Rooms in Low Acuity Settings: A Systematic Review of the Literature. HERD. 2018 Jan;11(1):57-74. doi: 10.1177/1937586717702597. </w:t>
       </w:r>
     </w:p>
     <w:p>
@@ -9904,6 +9840,21 @@
 </file>
 
 <file path=customXml/item3.xml><?xml version="1.0" encoding="utf-8"?>
+<b:Sources xmlns:b="http://schemas.openxmlformats.org/officeDocument/2006/bibliography" xmlns="http://schemas.openxmlformats.org/officeDocument/2006/bibliography" SelectedStyle="\APASixthEditionOfficeOnline.xsl" StyleName="APA" Version="6"/>
+</file>
+
+<file path=customXml/item4.xml><?xml version="1.0" encoding="utf-8"?>
+<p:properties xmlns:p="http://schemas.microsoft.com/office/2006/metadata/properties" xmlns:xsi="http://www.w3.org/2001/XMLSchema-instance" xmlns:pc="http://schemas.microsoft.com/office/infopath/2007/PartnerControls">
+  <documentManagement>
+    <lcf76f155ced4ddcb4097134ff3c332f xmlns="6303f13c-72cc-47f0-aeed-d46f93b29717">
+      <Terms xmlns="http://schemas.microsoft.com/office/infopath/2007/PartnerControls"/>
+    </lcf76f155ced4ddcb4097134ff3c332f>
+    <TaxCatchAll xmlns="6fbcc8e4-81ed-40b2-9b21-aa98bc8e658d" xsi:nil="true"/>
+  </documentManagement>
+</p:properties>
+</file>
+
+<file path=customXml/item5.xml><?xml version="1.0" encoding="utf-8"?>
 <ct:contentTypeSchema xmlns:ct="http://schemas.microsoft.com/office/2006/metadata/contentType" xmlns:ma="http://schemas.microsoft.com/office/2006/metadata/properties/metaAttributes" ct:_="" ma:_="" ma:contentTypeName="Document" ma:contentTypeID="0x01010003C3297AEF9452489C7FCE3B7D0A0240" ma:contentTypeVersion="18" ma:contentTypeDescription="Create a new document." ma:contentTypeScope="" ma:versionID="1ccb097adaeed9eb0eeb9354c7c3f9c4">
   <xsd:schema xmlns:xsd="http://www.w3.org/2001/XMLSchema" xmlns:xs="http://www.w3.org/2001/XMLSchema" xmlns:p="http://schemas.microsoft.com/office/2006/metadata/properties" xmlns:ns2="6303f13c-72cc-47f0-aeed-d46f93b29717" xmlns:ns3="6fbcc8e4-81ed-40b2-9b21-aa98bc8e658d" targetNamespace="http://schemas.microsoft.com/office/2006/metadata/properties" ma:root="true" ma:fieldsID="66ecee001987cab92525588c62778a1f" ns2:_="" ns3:_="">
     <xsd:import namespace="6303f13c-72cc-47f0-aeed-d46f93b29717"/>
@@ -10158,21 +10109,6 @@
 </ct:contentTypeSchema>
 </file>
 
-<file path=customXml/item4.xml><?xml version="1.0" encoding="utf-8"?>
-<p:properties xmlns:p="http://schemas.microsoft.com/office/2006/metadata/properties" xmlns:xsi="http://www.w3.org/2001/XMLSchema-instance" xmlns:pc="http://schemas.microsoft.com/office/infopath/2007/PartnerControls">
-  <documentManagement>
-    <lcf76f155ced4ddcb4097134ff3c332f xmlns="6303f13c-72cc-47f0-aeed-d46f93b29717">
-      <Terms xmlns="http://schemas.microsoft.com/office/infopath/2007/PartnerControls"/>
-    </lcf76f155ced4ddcb4097134ff3c332f>
-    <TaxCatchAll xmlns="6fbcc8e4-81ed-40b2-9b21-aa98bc8e658d" xsi:nil="true"/>
-  </documentManagement>
-</p:properties>
-</file>
-
-<file path=customXml/item5.xml><?xml version="1.0" encoding="utf-8"?>
-<b:Sources xmlns:b="http://schemas.openxmlformats.org/officeDocument/2006/bibliography" xmlns="http://schemas.openxmlformats.org/officeDocument/2006/bibliography" SelectedStyle="\APASixthEditionOfficeOnline.xsl" StyleName="APA" Version="6"/>
-</file>
-
 <file path=customXml/itemProps1.xml><?xml version="1.0" encoding="utf-8"?>
 <ds:datastoreItem xmlns:ds="http://schemas.openxmlformats.org/officeDocument/2006/customXml" ds:itemID="{55AF091B-3C7A-41E3-B477-F2FDAA23CFDA}">
   <ds:schemaRefs>
@@ -10190,6 +10126,25 @@
 </file>
 
 <file path=customXml/itemProps3.xml><?xml version="1.0" encoding="utf-8"?>
+<ds:datastoreItem xmlns:ds="http://schemas.openxmlformats.org/officeDocument/2006/customXml" ds:itemID="{308B3A6F-517D-402D-9A9B-F8F60567BA9F}">
+  <ds:schemaRefs>
+    <ds:schemaRef ds:uri="http://schemas.openxmlformats.org/officeDocument/2006/bibliography"/>
+  </ds:schemaRefs>
+</ds:datastoreItem>
+</file>
+
+<file path=customXml/itemProps4.xml><?xml version="1.0" encoding="utf-8"?>
+<ds:datastoreItem xmlns:ds="http://schemas.openxmlformats.org/officeDocument/2006/customXml" ds:itemID="{9808B4E2-4289-4E8E-B008-90A7311206B5}">
+  <ds:schemaRefs>
+    <ds:schemaRef ds:uri="http://schemas.microsoft.com/office/2006/metadata/properties"/>
+    <ds:schemaRef ds:uri="http://schemas.microsoft.com/office/infopath/2007/PartnerControls"/>
+    <ds:schemaRef ds:uri="6303f13c-72cc-47f0-aeed-d46f93b29717"/>
+    <ds:schemaRef ds:uri="6fbcc8e4-81ed-40b2-9b21-aa98bc8e658d"/>
+  </ds:schemaRefs>
+</ds:datastoreItem>
+</file>
+
+<file path=customXml/itemProps5.xml><?xml version="1.0" encoding="utf-8"?>
 <ds:datastoreItem xmlns:ds="http://schemas.openxmlformats.org/officeDocument/2006/customXml" ds:itemID="{8D82154A-8925-4D70-8E81-8FCE0F18F3BE}">
   <ds:schemaRefs>
     <ds:schemaRef ds:uri="http://schemas.microsoft.com/office/2006/metadata/contentType"/>
@@ -10208,25 +10163,6 @@
 </ds:datastoreItem>
 </file>
 
-<file path=customXml/itemProps4.xml><?xml version="1.0" encoding="utf-8"?>
-<ds:datastoreItem xmlns:ds="http://schemas.openxmlformats.org/officeDocument/2006/customXml" ds:itemID="{9808B4E2-4289-4E8E-B008-90A7311206B5}">
-  <ds:schemaRefs>
-    <ds:schemaRef ds:uri="http://schemas.microsoft.com/office/2006/metadata/properties"/>
-    <ds:schemaRef ds:uri="http://schemas.microsoft.com/office/infopath/2007/PartnerControls"/>
-    <ds:schemaRef ds:uri="6303f13c-72cc-47f0-aeed-d46f93b29717"/>
-    <ds:schemaRef ds:uri="6fbcc8e4-81ed-40b2-9b21-aa98bc8e658d"/>
-  </ds:schemaRefs>
-</ds:datastoreItem>
-</file>
-
-<file path=customXml/itemProps5.xml><?xml version="1.0" encoding="utf-8"?>
-<ds:datastoreItem xmlns:ds="http://schemas.openxmlformats.org/officeDocument/2006/customXml" ds:itemID="{308B3A6F-517D-402D-9A9B-F8F60567BA9F}">
-  <ds:schemaRefs>
-    <ds:schemaRef ds:uri="http://schemas.openxmlformats.org/officeDocument/2006/bibliography"/>
-  </ds:schemaRefs>
-</ds:datastoreItem>
-</file>
-
 <file path=docMetadata/LabelInfo.xml><?xml version="1.0" encoding="utf-8"?>
 <clbl:labelList xmlns:clbl="http://schemas.microsoft.com/office/2020/mipLabelMetadata">
   <clbl:label id="{37c354b2-85b0-47f5-b222-07b48d774ee3}" enabled="0" method="" siteId="{37c354b2-85b0-47f5-b222-07b48d774ee3}" removed="1"/>

</xml_diff>

<commit_message>
Case study for hackathon final amends.
Revised summary presentation qmd for pushing through NHP publications group
</commit_message>
<xml_diff>
--- a/NHP Report Template_SBR_casestudy.docx
+++ b/NHP Report Template_SBR_casestudy.docx
@@ -102,6 +102,7 @@
                                     <w:calendar w:val="gregorian"/>
                                   </w:date>
                                 </w:sdtPr>
+                                <w:sdtEndPr/>
                                 <w:sdtContent>
                                   <w:p>
                                     <w:pPr>
@@ -168,6 +169,7 @@
                               <w:calendar w:val="gregorian"/>
                             </w:date>
                           </w:sdtPr>
+                          <w:sdtEndPr/>
                           <w:sdtContent>
                             <w:p>
                               <w:pPr>
@@ -385,7 +387,29 @@
                                       <w:sz w:val="52"/>
                                       <w:szCs w:val="52"/>
                                     </w:rPr>
-                                    <w:t>Quantifying the impacts of Single-Bed hospital accommodation: a case study</w:t>
+                                    <w:t xml:space="preserve">Quantifying the impacts of </w:t>
+                                  </w:r>
+                                  <w:r>
+                                    <w:rPr>
+                                      <w:rFonts w:ascii="Arial" w:hAnsi="Arial" w:cs="Arial"/>
+                                      <w:b/>
+                                      <w:bCs/>
+                                      <w:color w:val="FFFFFF" w:themeColor="background1"/>
+                                      <w:sz w:val="52"/>
+                                      <w:szCs w:val="52"/>
+                                    </w:rPr>
+                                    <w:t xml:space="preserve">increased </w:t>
+                                  </w:r>
+                                  <w:r>
+                                    <w:rPr>
+                                      <w:rFonts w:ascii="Arial" w:hAnsi="Arial" w:cs="Arial"/>
+                                      <w:b/>
+                                      <w:bCs/>
+                                      <w:color w:val="FFFFFF" w:themeColor="background1"/>
+                                      <w:sz w:val="52"/>
+                                      <w:szCs w:val="52"/>
+                                    </w:rPr>
+                                    <w:t>Single-Bed hospital accommodation: a case study</w:t>
                                   </w:r>
                                 </w:p>
                               </w:txbxContent>
@@ -541,7 +565,29 @@
                                 <w:sz w:val="52"/>
                                 <w:szCs w:val="52"/>
                               </w:rPr>
-                              <w:t>Quantifying the impacts of Single-Bed hospital accommodation: a case study</w:t>
+                              <w:t xml:space="preserve">Quantifying the impacts of </w:t>
+                            </w:r>
+                            <w:r>
+                              <w:rPr>
+                                <w:rFonts w:ascii="Arial" w:hAnsi="Arial" w:cs="Arial"/>
+                                <w:b/>
+                                <w:bCs/>
+                                <w:color w:val="FFFFFF" w:themeColor="background1"/>
+                                <w:sz w:val="52"/>
+                                <w:szCs w:val="52"/>
+                              </w:rPr>
+                              <w:t xml:space="preserve">increased </w:t>
+                            </w:r>
+                            <w:r>
+                              <w:rPr>
+                                <w:rFonts w:ascii="Arial" w:hAnsi="Arial" w:cs="Arial"/>
+                                <w:b/>
+                                <w:bCs/>
+                                <w:color w:val="FFFFFF" w:themeColor="background1"/>
+                                <w:sz w:val="52"/>
+                                <w:szCs w:val="52"/>
+                              </w:rPr>
+                              <w:t>Single-Bed hospital accommodation: a case study</w:t>
                             </w:r>
                           </w:p>
                         </w:txbxContent>
@@ -960,6 +1006,7 @@
                                 <w:dataBinding w:prefixMappings="xmlns:ns0='http://schemas.openxmlformats.org/officeDocument/2006/extended-properties' " w:xpath="/ns0:Properties[1]/ns0:Company[1]" w:storeItemID="{6668398D-A668-4E3E-A5EB-62B293D839F1}"/>
                                 <w:text/>
                               </w:sdtPr>
+                              <w:sdtEndPr/>
                               <w:sdtContent>
                                 <w:r>
                                   <w:rPr>
@@ -1006,6 +1053,7 @@
                                 <w:dataBinding w:prefixMappings="xmlns:ns0='http://schemas.microsoft.com/office/2006/coverPageProps' " w:xpath="/ns0:CoverPageProperties[1]/ns0:CompanyAddress[1]" w:storeItemID="{55AF091B-3C7A-41E3-B477-F2FDAA23CFDA}"/>
                                 <w:text/>
                               </w:sdtPr>
+                              <w:sdtEndPr/>
                               <w:sdtContent>
                                 <w:r>
                                   <w:rPr>
@@ -1073,6 +1121,7 @@
                           <w:dataBinding w:prefixMappings="xmlns:ns0='http://schemas.openxmlformats.org/officeDocument/2006/extended-properties' " w:xpath="/ns0:Properties[1]/ns0:Company[1]" w:storeItemID="{6668398D-A668-4E3E-A5EB-62B293D839F1}"/>
                           <w:text/>
                         </w:sdtPr>
+                        <w:sdtEndPr/>
                         <w:sdtContent>
                           <w:r>
                             <w:rPr>
@@ -1119,6 +1168,7 @@
                           <w:dataBinding w:prefixMappings="xmlns:ns0='http://schemas.microsoft.com/office/2006/coverPageProps' " w:xpath="/ns0:CoverPageProperties[1]/ns0:CompanyAddress[1]" w:storeItemID="{55AF091B-3C7A-41E3-B477-F2FDAA23CFDA}"/>
                           <w:text/>
                         </w:sdtPr>
+                        <w:sdtEndPr/>
                         <w:sdtContent>
                           <w:r>
                             <w:rPr>
@@ -1209,6 +1259,7 @@
                               <w:dataBinding w:prefixMappings="xmlns:ns0='http://purl.org/dc/elements/1.1/' xmlns:ns1='http://schemas.openxmlformats.org/package/2006/metadata/core-properties' " w:xpath="/ns1:coreProperties[1]/ns0:subject[1]" w:storeItemID="{6C3C8BC8-F283-45AE-878A-BAB7291924A1}"/>
                               <w:text/>
                             </w:sdtPr>
+                            <w:sdtEndPr/>
                             <w:sdtContent>
                               <w:p>
                                 <w:pPr>
@@ -1272,6 +1323,7 @@
                               <w:dataBinding w:prefixMappings="xmlns:ns0='http://purl.org/dc/elements/1.1/' xmlns:ns1='http://schemas.openxmlformats.org/package/2006/metadata/core-properties' " w:xpath="/ns1:coreProperties[1]/ns0:creator[1]" w:storeItemID="{6C3C8BC8-F283-45AE-878A-BAB7291924A1}"/>
                               <w:text/>
                             </w:sdtPr>
+                            <w:sdtEndPr/>
                             <w:sdtContent>
                               <w:p>
                                 <w:pPr>
@@ -1350,6 +1402,7 @@
                         <w:dataBinding w:prefixMappings="xmlns:ns0='http://purl.org/dc/elements/1.1/' xmlns:ns1='http://schemas.openxmlformats.org/package/2006/metadata/core-properties' " w:xpath="/ns1:coreProperties[1]/ns0:subject[1]" w:storeItemID="{6C3C8BC8-F283-45AE-878A-BAB7291924A1}"/>
                         <w:text/>
                       </w:sdtPr>
+                      <w:sdtEndPr/>
                       <w:sdtContent>
                         <w:p>
                           <w:pPr>
@@ -1413,6 +1466,7 @@
                         <w:dataBinding w:prefixMappings="xmlns:ns0='http://purl.org/dc/elements/1.1/' xmlns:ns1='http://schemas.openxmlformats.org/package/2006/metadata/core-properties' " w:xpath="/ns1:coreProperties[1]/ns0:creator[1]" w:storeItemID="{6C3C8BC8-F283-45AE-878A-BAB7291924A1}"/>
                         <w:text/>
                       </w:sdtPr>
+                      <w:sdtEndPr/>
                       <w:sdtContent>
                         <w:p>
                           <w:pPr>
@@ -1479,7 +1533,27 @@
           <w:szCs w:val="36"/>
         </w:rPr>
         <w:lastRenderedPageBreak/>
-        <w:t>Quantifying the impacts of Single-Bed hospital accommodation</w:t>
+        <w:t xml:space="preserve">Quantifying the impacts of </w:t>
+      </w:r>
+      <w:r>
+        <w:rPr>
+          <w:rFonts w:ascii="Arial" w:hAnsi="Arial" w:cs="Arial"/>
+          <w:b/>
+          <w:bCs/>
+          <w:sz w:val="36"/>
+          <w:szCs w:val="36"/>
+        </w:rPr>
+        <w:t xml:space="preserve">increased </w:t>
+      </w:r>
+      <w:r>
+        <w:rPr>
+          <w:rFonts w:ascii="Arial" w:hAnsi="Arial" w:cs="Arial"/>
+          <w:b/>
+          <w:bCs/>
+          <w:sz w:val="36"/>
+          <w:szCs w:val="36"/>
+        </w:rPr>
+        <w:t>Single-Bed hospital accommodation</w:t>
       </w:r>
     </w:p>
     <w:p>
@@ -1656,7 +1730,25 @@
           <w:sz w:val="24"/>
           <w:szCs w:val="24"/>
         </w:rPr>
-        <w:t xml:space="preserve">., 2018; van de Glind </w:t>
+        <w:t xml:space="preserve">., 2018; van de </w:t>
+      </w:r>
+      <w:proofErr w:type="spellStart"/>
+      <w:r>
+        <w:rPr>
+          <w:rFonts w:ascii="Arial" w:hAnsi="Arial" w:cs="Arial"/>
+          <w:sz w:val="24"/>
+          <w:szCs w:val="24"/>
+        </w:rPr>
+        <w:t>Glind</w:t>
+      </w:r>
+      <w:proofErr w:type="spellEnd"/>
+      <w:r>
+        <w:rPr>
+          <w:rFonts w:ascii="Arial" w:hAnsi="Arial" w:cs="Arial"/>
+          <w:sz w:val="24"/>
+          <w:szCs w:val="24"/>
+        </w:rPr>
+        <w:t xml:space="preserve"> </w:t>
       </w:r>
       <w:r>
         <w:rPr>
@@ -1768,7 +1860,25 @@
           <w:sz w:val="24"/>
           <w:szCs w:val="24"/>
         </w:rPr>
-        <w:t xml:space="preserve"> In order to do so we identified 7 hospital sites acting as ‘natural experiments’ across England between 2010 and 2022.</w:t>
+        <w:t xml:space="preserve"> </w:t>
+      </w:r>
+      <w:proofErr w:type="gramStart"/>
+      <w:r>
+        <w:rPr>
+          <w:rFonts w:ascii="Arial" w:hAnsi="Arial" w:cs="Arial"/>
+          <w:sz w:val="24"/>
+          <w:szCs w:val="24"/>
+        </w:rPr>
+        <w:t>In order to</w:t>
+      </w:r>
+      <w:proofErr w:type="gramEnd"/>
+      <w:r>
+        <w:rPr>
+          <w:rFonts w:ascii="Arial" w:hAnsi="Arial" w:cs="Arial"/>
+          <w:sz w:val="24"/>
+          <w:szCs w:val="24"/>
+        </w:rPr>
+        <w:t xml:space="preserve"> do so we identified 7 hospital sites acting as ‘natural experiments’ across England between 2010 and 2022.</w:t>
       </w:r>
     </w:p>
     <w:p>
@@ -2716,6 +2826,7 @@
         </w:rPr>
         <w:t xml:space="preserve">Our analyses rely on historical data collections meaning that some data recording does not go back as far enough to use for all the study hospitals or there are gaps/anomalies in the time series. </w:t>
       </w:r>
+      <w:proofErr w:type="gramStart"/>
       <w:r>
         <w:rPr>
           <w:rFonts w:ascii="Arial" w:hAnsi="Arial" w:cs="Arial"/>
@@ -2730,7 +2841,16 @@
           <w:sz w:val="24"/>
           <w:szCs w:val="24"/>
         </w:rPr>
-        <w:t>ly s</w:t>
+        <w:t>ly</w:t>
+      </w:r>
+      <w:proofErr w:type="gramEnd"/>
+      <w:r>
+        <w:rPr>
+          <w:rFonts w:ascii="Arial" w:hAnsi="Arial" w:cs="Arial"/>
+          <w:sz w:val="24"/>
+          <w:szCs w:val="24"/>
+        </w:rPr>
+        <w:t xml:space="preserve"> s</w:t>
       </w:r>
       <w:r>
         <w:rPr>
@@ -2958,7 +3078,23 @@
           <w:sz w:val="24"/>
           <w:szCs w:val="24"/>
         </w:rPr>
-        <w:t>Whilst the results are mixed (and need to be contextualised by local circumstances, policies, cultures and environments) there is a clear need to more reliably measure and monitor these and other outcomes before, during and after the implementation of SBR builds under the NHP and beyond.</w:t>
+        <w:t>Whilst the results are mixed and need to be contextualised by local circumstances, policies, cultures and environments</w:t>
+      </w:r>
+      <w:r>
+        <w:rPr>
+          <w:rFonts w:ascii="Arial" w:hAnsi="Arial" w:cs="Arial"/>
+          <w:sz w:val="24"/>
+          <w:szCs w:val="24"/>
+        </w:rPr>
+        <w:t>,</w:t>
+      </w:r>
+      <w:r>
+        <w:rPr>
+          <w:rFonts w:ascii="Arial" w:hAnsi="Arial" w:cs="Arial"/>
+          <w:sz w:val="24"/>
+          <w:szCs w:val="24"/>
+        </w:rPr>
+        <w:t xml:space="preserve"> there is a clear need to more reliably measure and monitor these and other outcomes before, during and after the implementation of SBR builds under the NHP and beyond.</w:t>
       </w:r>
     </w:p>
     <w:p>
@@ -3223,7 +3359,43 @@
           <w:sz w:val="24"/>
           <w:szCs w:val="24"/>
         </w:rPr>
-        <w:t>Bertuzzi A, Martin A, Clarke N et al. Clinical, humanistic and economic outcomes, including experiencing of patient safety events, associated with admitting patients to single rooms compared with shared accommodation for acute hospital admissions: a systematic review and narrative synthesis. BMJ Open. 2023 May 5;13(5):e068932. doi: 10.1136/bmjopen-2022-068932.</w:t>
+        <w:t>Bertuzzi A, Martin A, Clarke N et al. Clinical, humanistic and economic outcomes, including experiencing of patient safety events, associated with admitting patients to single rooms compared with shared accommodation for acute hospital admissions: a systematic review and narrative synthesis. BMJ Open. 2023 May 5;13(5</w:t>
+      </w:r>
+      <w:proofErr w:type="gramStart"/>
+      <w:r>
+        <w:rPr>
+          <w:rFonts w:ascii="Arial" w:hAnsi="Arial" w:cs="Arial"/>
+          <w:sz w:val="24"/>
+          <w:szCs w:val="24"/>
+        </w:rPr>
+        <w:t>):e</w:t>
+      </w:r>
+      <w:proofErr w:type="gramEnd"/>
+      <w:r>
+        <w:rPr>
+          <w:rFonts w:ascii="Arial" w:hAnsi="Arial" w:cs="Arial"/>
+          <w:sz w:val="24"/>
+          <w:szCs w:val="24"/>
+        </w:rPr>
+        <w:t xml:space="preserve">068932. </w:t>
+      </w:r>
+      <w:proofErr w:type="spellStart"/>
+      <w:r>
+        <w:rPr>
+          <w:rFonts w:ascii="Arial" w:hAnsi="Arial" w:cs="Arial"/>
+          <w:sz w:val="24"/>
+          <w:szCs w:val="24"/>
+        </w:rPr>
+        <w:t>doi</w:t>
+      </w:r>
+      <w:proofErr w:type="spellEnd"/>
+      <w:r>
+        <w:rPr>
+          <w:rFonts w:ascii="Arial" w:hAnsi="Arial" w:cs="Arial"/>
+          <w:sz w:val="24"/>
+          <w:szCs w:val="24"/>
+        </w:rPr>
+        <w:t>: 10.1136/bmjopen-2022-068932.</w:t>
       </w:r>
     </w:p>
     <w:p>
@@ -3257,7 +3429,25 @@
           <w:sz w:val="24"/>
           <w:szCs w:val="24"/>
         </w:rPr>
-        <w:t>Taylor E, Card AJ, Piatkowski M. Single-Occupancy Patient Rooms: A Systematic Review of the Literature Since 2006. HERD. 2018 Jan;11(1):85-100. doi: 10.1177/1937586718755110.</w:t>
+        <w:t xml:space="preserve">Taylor E, Card AJ, Piatkowski M. Single-Occupancy Patient Rooms: A Systematic Review of the Literature Since 2006. HERD. 2018 Jan;11(1):85-100. </w:t>
+      </w:r>
+      <w:proofErr w:type="spellStart"/>
+      <w:r>
+        <w:rPr>
+          <w:rFonts w:ascii="Arial" w:hAnsi="Arial" w:cs="Arial"/>
+          <w:sz w:val="24"/>
+          <w:szCs w:val="24"/>
+        </w:rPr>
+        <w:t>doi</w:t>
+      </w:r>
+      <w:proofErr w:type="spellEnd"/>
+      <w:r>
+        <w:rPr>
+          <w:rFonts w:ascii="Arial" w:hAnsi="Arial" w:cs="Arial"/>
+          <w:sz w:val="24"/>
+          <w:szCs w:val="24"/>
+        </w:rPr>
+        <w:t>: 10.1177/1937586718755110.</w:t>
       </w:r>
     </w:p>
     <w:p>
@@ -3274,7 +3464,61 @@
           <w:sz w:val="24"/>
           <w:szCs w:val="24"/>
         </w:rPr>
-        <w:t>van de Glind I, de Roode S, Goossensen A. Do patients in hospitals benefit from single rooms? A literature review. Health Policy. 2007 Dec;84(2-3):153-61. doi: 10.1016/j.healthpol.2007.06.002.</w:t>
+        <w:t xml:space="preserve">van de </w:t>
+      </w:r>
+      <w:proofErr w:type="spellStart"/>
+      <w:r>
+        <w:rPr>
+          <w:rFonts w:ascii="Arial" w:hAnsi="Arial" w:cs="Arial"/>
+          <w:sz w:val="24"/>
+          <w:szCs w:val="24"/>
+        </w:rPr>
+        <w:t>Glind</w:t>
+      </w:r>
+      <w:proofErr w:type="spellEnd"/>
+      <w:r>
+        <w:rPr>
+          <w:rFonts w:ascii="Arial" w:hAnsi="Arial" w:cs="Arial"/>
+          <w:sz w:val="24"/>
+          <w:szCs w:val="24"/>
+        </w:rPr>
+        <w:t xml:space="preserve"> I, de Roode S, </w:t>
+      </w:r>
+      <w:proofErr w:type="spellStart"/>
+      <w:r>
+        <w:rPr>
+          <w:rFonts w:ascii="Arial" w:hAnsi="Arial" w:cs="Arial"/>
+          <w:sz w:val="24"/>
+          <w:szCs w:val="24"/>
+        </w:rPr>
+        <w:t>Goossensen</w:t>
+      </w:r>
+      <w:proofErr w:type="spellEnd"/>
+      <w:r>
+        <w:rPr>
+          <w:rFonts w:ascii="Arial" w:hAnsi="Arial" w:cs="Arial"/>
+          <w:sz w:val="24"/>
+          <w:szCs w:val="24"/>
+        </w:rPr>
+        <w:t xml:space="preserve"> A. Do patients in hospitals benefit from single rooms? A literature review. Health Policy. 2007 Dec;84(2-3):153-61. </w:t>
+      </w:r>
+      <w:proofErr w:type="spellStart"/>
+      <w:r>
+        <w:rPr>
+          <w:rFonts w:ascii="Arial" w:hAnsi="Arial" w:cs="Arial"/>
+          <w:sz w:val="24"/>
+          <w:szCs w:val="24"/>
+        </w:rPr>
+        <w:t>doi</w:t>
+      </w:r>
+      <w:proofErr w:type="spellEnd"/>
+      <w:r>
+        <w:rPr>
+          <w:rFonts w:ascii="Arial" w:hAnsi="Arial" w:cs="Arial"/>
+          <w:sz w:val="24"/>
+          <w:szCs w:val="24"/>
+        </w:rPr>
+        <w:t>: 10.1016/j.healthpol.2007.06.002.</w:t>
       </w:r>
     </w:p>
     <w:p>
@@ -3291,7 +3535,43 @@
           <w:sz w:val="24"/>
           <w:szCs w:val="24"/>
         </w:rPr>
-        <w:t xml:space="preserve">Voigt J, Mosier M, Darouiche R. Private Rooms in Low Acuity Settings: A Systematic Review of the Literature. HERD. 2018 Jan;11(1):57-74. doi: 10.1177/1937586717702597. </w:t>
+        <w:t xml:space="preserve">Voigt J, Mosier M, </w:t>
+      </w:r>
+      <w:proofErr w:type="spellStart"/>
+      <w:r>
+        <w:rPr>
+          <w:rFonts w:ascii="Arial" w:hAnsi="Arial" w:cs="Arial"/>
+          <w:sz w:val="24"/>
+          <w:szCs w:val="24"/>
+        </w:rPr>
+        <w:t>Darouiche</w:t>
+      </w:r>
+      <w:proofErr w:type="spellEnd"/>
+      <w:r>
+        <w:rPr>
+          <w:rFonts w:ascii="Arial" w:hAnsi="Arial" w:cs="Arial"/>
+          <w:sz w:val="24"/>
+          <w:szCs w:val="24"/>
+        </w:rPr>
+        <w:t xml:space="preserve"> R. Private Rooms in Low Acuity Settings: A Systematic Review of the Literature. HERD. 2018 Jan;11(1):57-74. </w:t>
+      </w:r>
+      <w:proofErr w:type="spellStart"/>
+      <w:r>
+        <w:rPr>
+          <w:rFonts w:ascii="Arial" w:hAnsi="Arial" w:cs="Arial"/>
+          <w:sz w:val="24"/>
+          <w:szCs w:val="24"/>
+        </w:rPr>
+        <w:t>doi</w:t>
+      </w:r>
+      <w:proofErr w:type="spellEnd"/>
+      <w:r>
+        <w:rPr>
+          <w:rFonts w:ascii="Arial" w:hAnsi="Arial" w:cs="Arial"/>
+          <w:sz w:val="24"/>
+          <w:szCs w:val="24"/>
+        </w:rPr>
+        <w:t>: 10.1177/1937586717702597.</w:t>
       </w:r>
     </w:p>
     <w:p>
@@ -3302,14 +3582,6 @@
           <w:szCs w:val="24"/>
         </w:rPr>
       </w:pPr>
-      <w:r>
-        <w:rPr>
-          <w:rFonts w:ascii="Arial" w:hAnsi="Arial" w:cs="Arial"/>
-          <w:sz w:val="24"/>
-          <w:szCs w:val="24"/>
-        </w:rPr>
-        <w:tab/>
-      </w:r>
     </w:p>
     <w:p>
       <w:pPr>
@@ -3320,13 +3592,249 @@
         </w:rPr>
       </w:pPr>
     </w:p>
+    <w:p>
+      <w:pPr>
+        <w:rPr>
+          <w:rFonts w:ascii="Arial" w:hAnsi="Arial" w:cs="Arial"/>
+          <w:sz w:val="24"/>
+          <w:szCs w:val="24"/>
+        </w:rPr>
+      </w:pPr>
+    </w:p>
+    <w:p>
+      <w:pPr>
+        <w:rPr>
+          <w:rFonts w:ascii="Arial" w:hAnsi="Arial" w:cs="Arial"/>
+          <w:b/>
+          <w:bCs/>
+          <w:sz w:val="24"/>
+          <w:szCs w:val="24"/>
+        </w:rPr>
+      </w:pPr>
+    </w:p>
+    <w:p>
+      <w:pPr>
+        <w:rPr>
+          <w:rFonts w:ascii="Arial" w:hAnsi="Arial" w:cs="Arial"/>
+          <w:b/>
+          <w:bCs/>
+          <w:sz w:val="24"/>
+          <w:szCs w:val="24"/>
+        </w:rPr>
+      </w:pPr>
+    </w:p>
+    <w:p>
+      <w:pPr>
+        <w:rPr>
+          <w:rFonts w:ascii="Arial" w:hAnsi="Arial" w:cs="Arial"/>
+          <w:b/>
+          <w:bCs/>
+          <w:sz w:val="24"/>
+          <w:szCs w:val="24"/>
+        </w:rPr>
+      </w:pPr>
+    </w:p>
+    <w:p>
+      <w:pPr>
+        <w:rPr>
+          <w:rFonts w:ascii="Arial" w:hAnsi="Arial" w:cs="Arial"/>
+          <w:b/>
+          <w:bCs/>
+          <w:sz w:val="24"/>
+          <w:szCs w:val="24"/>
+        </w:rPr>
+      </w:pPr>
+    </w:p>
+    <w:p>
+      <w:pPr>
+        <w:rPr>
+          <w:rFonts w:ascii="Arial" w:hAnsi="Arial" w:cs="Arial"/>
+          <w:b/>
+          <w:bCs/>
+          <w:sz w:val="24"/>
+          <w:szCs w:val="24"/>
+        </w:rPr>
+      </w:pPr>
+    </w:p>
+    <w:p>
+      <w:pPr>
+        <w:rPr>
+          <w:rFonts w:ascii="Arial" w:hAnsi="Arial" w:cs="Arial"/>
+          <w:b/>
+          <w:bCs/>
+          <w:sz w:val="24"/>
+          <w:szCs w:val="24"/>
+        </w:rPr>
+      </w:pPr>
+    </w:p>
+    <w:p>
+      <w:pPr>
+        <w:rPr>
+          <w:rFonts w:ascii="Arial" w:hAnsi="Arial" w:cs="Arial"/>
+          <w:b/>
+          <w:bCs/>
+          <w:sz w:val="24"/>
+          <w:szCs w:val="24"/>
+        </w:rPr>
+      </w:pPr>
+    </w:p>
+    <w:p>
+      <w:pPr>
+        <w:rPr>
+          <w:rFonts w:ascii="Arial" w:hAnsi="Arial" w:cs="Arial"/>
+          <w:b/>
+          <w:bCs/>
+          <w:sz w:val="24"/>
+          <w:szCs w:val="24"/>
+        </w:rPr>
+      </w:pPr>
+    </w:p>
+    <w:p>
+      <w:pPr>
+        <w:rPr>
+          <w:rFonts w:ascii="Arial" w:hAnsi="Arial" w:cs="Arial"/>
+          <w:sz w:val="24"/>
+          <w:szCs w:val="24"/>
+        </w:rPr>
+      </w:pPr>
+      <w:r>
+        <w:rPr>
+          <w:rFonts w:ascii="Arial" w:hAnsi="Arial" w:cs="Arial"/>
+          <w:b/>
+          <w:bCs/>
+          <w:sz w:val="24"/>
+          <w:szCs w:val="24"/>
+        </w:rPr>
+        <w:t>Contact:</w:t>
+      </w:r>
+      <w:r>
+        <w:rPr>
+          <w:rFonts w:ascii="Arial" w:hAnsi="Arial" w:cs="Arial"/>
+          <w:sz w:val="24"/>
+          <w:szCs w:val="24"/>
+        </w:rPr>
+        <w:br/>
+      </w:r>
+      <w:r>
+        <w:rPr>
+          <w:rFonts w:ascii="Arial" w:hAnsi="Arial" w:cs="Arial"/>
+          <w:sz w:val="24"/>
+          <w:szCs w:val="24"/>
+        </w:rPr>
+        <w:br/>
+        <w:t xml:space="preserve">For </w:t>
+      </w:r>
+      <w:r>
+        <w:rPr>
+          <w:rFonts w:ascii="Arial" w:hAnsi="Arial" w:cs="Arial"/>
+          <w:sz w:val="24"/>
+          <w:szCs w:val="24"/>
+        </w:rPr>
+        <w:t xml:space="preserve">any </w:t>
+      </w:r>
+      <w:r>
+        <w:rPr>
+          <w:rFonts w:ascii="Arial" w:hAnsi="Arial" w:cs="Arial"/>
+          <w:sz w:val="24"/>
+          <w:szCs w:val="24"/>
+        </w:rPr>
+        <w:t xml:space="preserve">correspondence </w:t>
+      </w:r>
+      <w:r>
+        <w:rPr>
+          <w:rFonts w:ascii="Arial" w:hAnsi="Arial" w:cs="Arial"/>
+          <w:sz w:val="24"/>
+          <w:szCs w:val="24"/>
+        </w:rPr>
+        <w:t xml:space="preserve">on this case study please contact Andy </w:t>
+      </w:r>
+      <w:proofErr w:type="spellStart"/>
+      <w:r>
+        <w:rPr>
+          <w:rFonts w:ascii="Arial" w:hAnsi="Arial" w:cs="Arial"/>
+          <w:sz w:val="24"/>
+          <w:szCs w:val="24"/>
+        </w:rPr>
+        <w:t>Hood</w:t>
+      </w:r>
+      <w:r>
+        <w:rPr>
+          <w:rFonts w:ascii="Arial" w:hAnsi="Arial" w:cs="Arial"/>
+          <w:sz w:val="24"/>
+          <w:szCs w:val="24"/>
+        </w:rPr>
+        <w:t>,</w:t>
+      </w:r>
+      <w:proofErr w:type="spellEnd"/>
+      <w:r>
+        <w:rPr>
+          <w:rFonts w:ascii="Arial" w:hAnsi="Arial" w:cs="Arial"/>
+          <w:sz w:val="24"/>
+          <w:szCs w:val="24"/>
+        </w:rPr>
+        <w:t xml:space="preserve"> Analytics Manager (Strategy Unit)</w:t>
+      </w:r>
+      <w:r>
+        <w:rPr>
+          <w:rFonts w:ascii="Arial" w:hAnsi="Arial" w:cs="Arial"/>
+          <w:sz w:val="24"/>
+          <w:szCs w:val="24"/>
+        </w:rPr>
+        <w:t xml:space="preserve">, </w:t>
+      </w:r>
+      <w:hyperlink r:id="rId17" w:history="1">
+        <w:r>
+          <w:rPr>
+            <w:rStyle w:val="Hyperlink"/>
+            <w:rFonts w:ascii="Arial" w:hAnsi="Arial" w:cs="Arial"/>
+            <w:sz w:val="24"/>
+            <w:szCs w:val="24"/>
+          </w:rPr>
+          <w:t>andrewhood@nhs.net</w:t>
+        </w:r>
+      </w:hyperlink>
+      <w:r>
+        <w:rPr>
+          <w:rFonts w:ascii="Arial" w:hAnsi="Arial" w:cs="Arial"/>
+          <w:sz w:val="24"/>
+          <w:szCs w:val="24"/>
+        </w:rPr>
+        <w:t xml:space="preserve">. </w:t>
+      </w:r>
+    </w:p>
+    <w:p>
+      <w:pPr>
+        <w:rPr>
+          <w:rFonts w:ascii="Arial" w:hAnsi="Arial" w:cs="Arial"/>
+          <w:sz w:val="24"/>
+          <w:szCs w:val="24"/>
+        </w:rPr>
+      </w:pPr>
+      <w:r>
+        <w:rPr>
+          <w:rFonts w:ascii="Arial" w:hAnsi="Arial" w:cs="Arial"/>
+          <w:sz w:val="24"/>
+          <w:szCs w:val="24"/>
+        </w:rPr>
+        <w:tab/>
+      </w:r>
+    </w:p>
+    <w:p>
+      <w:pPr>
+        <w:rPr>
+          <w:rFonts w:ascii="Arial" w:hAnsi="Arial" w:cs="Arial"/>
+          <w:sz w:val="24"/>
+          <w:szCs w:val="24"/>
+        </w:rPr>
+      </w:pPr>
+    </w:p>
     <w:sectPr>
-      <w:headerReference w:type="even" r:id="rId17"/>
-      <w:headerReference w:type="default" r:id="rId18"/>
-      <w:footerReference w:type="even" r:id="rId19"/>
-      <w:footerReference w:type="default" r:id="rId20"/>
-      <w:headerReference w:type="first" r:id="rId21"/>
-      <w:footerReference w:type="first" r:id="rId22"/>
+      <w:headerReference w:type="even" r:id="rId18"/>
+      <w:headerReference w:type="default" r:id="rId19"/>
+      <w:footerReference w:type="even" r:id="rId20"/>
+      <w:footerReference w:type="default" r:id="rId21"/>
+      <w:headerReference w:type="first" r:id="rId22"/>
+      <w:footerReference w:type="first" r:id="rId23"/>
       <w:pgSz w:w="11906" w:h="16838"/>
       <w:pgMar w:top="720" w:right="720" w:bottom="720" w:left="720" w:header="567" w:footer="1134" w:gutter="0"/>
       <w:pgNumType w:start="0"/>
@@ -9521,6 +10029,29 @@
       <w14:ligatures w14:val="standardContextual"/>
     </w:rPr>
   </w:style>
+  <w:style w:type="character" w:styleId="Hyperlink">
+    <w:name w:val="Hyperlink"/>
+    <w:basedOn w:val="DefaultParagraphFont"/>
+    <w:uiPriority w:val="99"/>
+    <w:unhideWhenUsed/>
+    <w:rsid w:val="00FF652F"/>
+    <w:rPr>
+      <w:color w:val="467886" w:themeColor="hyperlink"/>
+      <w:u w:val="single"/>
+    </w:rPr>
+  </w:style>
+  <w:style w:type="character" w:styleId="UnresolvedMention">
+    <w:name w:val="Unresolved Mention"/>
+    <w:basedOn w:val="DefaultParagraphFont"/>
+    <w:uiPriority w:val="99"/>
+    <w:semiHidden/>
+    <w:unhideWhenUsed/>
+    <w:rsid w:val="00FF652F"/>
+    <w:rPr>
+      <w:color w:val="605E5C"/>
+      <w:shd w:val="clear" w:color="auto" w:fill="E1DFDD"/>
+    </w:rPr>
+  </w:style>
 </w:styles>
 </file>
 
@@ -9840,21 +10371,6 @@
 </file>
 
 <file path=customXml/item3.xml><?xml version="1.0" encoding="utf-8"?>
-<b:Sources xmlns:b="http://schemas.openxmlformats.org/officeDocument/2006/bibliography" xmlns="http://schemas.openxmlformats.org/officeDocument/2006/bibliography" SelectedStyle="\APASixthEditionOfficeOnline.xsl" StyleName="APA" Version="6"/>
-</file>
-
-<file path=customXml/item4.xml><?xml version="1.0" encoding="utf-8"?>
-<p:properties xmlns:p="http://schemas.microsoft.com/office/2006/metadata/properties" xmlns:xsi="http://www.w3.org/2001/XMLSchema-instance" xmlns:pc="http://schemas.microsoft.com/office/infopath/2007/PartnerControls">
-  <documentManagement>
-    <lcf76f155ced4ddcb4097134ff3c332f xmlns="6303f13c-72cc-47f0-aeed-d46f93b29717">
-      <Terms xmlns="http://schemas.microsoft.com/office/infopath/2007/PartnerControls"/>
-    </lcf76f155ced4ddcb4097134ff3c332f>
-    <TaxCatchAll xmlns="6fbcc8e4-81ed-40b2-9b21-aa98bc8e658d" xsi:nil="true"/>
-  </documentManagement>
-</p:properties>
-</file>
-
-<file path=customXml/item5.xml><?xml version="1.0" encoding="utf-8"?>
 <ct:contentTypeSchema xmlns:ct="http://schemas.microsoft.com/office/2006/metadata/contentType" xmlns:ma="http://schemas.microsoft.com/office/2006/metadata/properties/metaAttributes" ct:_="" ma:_="" ma:contentTypeName="Document" ma:contentTypeID="0x01010003C3297AEF9452489C7FCE3B7D0A0240" ma:contentTypeVersion="18" ma:contentTypeDescription="Create a new document." ma:contentTypeScope="" ma:versionID="1ccb097adaeed9eb0eeb9354c7c3f9c4">
   <xsd:schema xmlns:xsd="http://www.w3.org/2001/XMLSchema" xmlns:xs="http://www.w3.org/2001/XMLSchema" xmlns:p="http://schemas.microsoft.com/office/2006/metadata/properties" xmlns:ns2="6303f13c-72cc-47f0-aeed-d46f93b29717" xmlns:ns3="6fbcc8e4-81ed-40b2-9b21-aa98bc8e658d" targetNamespace="http://schemas.microsoft.com/office/2006/metadata/properties" ma:root="true" ma:fieldsID="66ecee001987cab92525588c62778a1f" ns2:_="" ns3:_="">
     <xsd:import namespace="6303f13c-72cc-47f0-aeed-d46f93b29717"/>
@@ -10109,6 +10625,21 @@
 </ct:contentTypeSchema>
 </file>
 
+<file path=customXml/item4.xml><?xml version="1.0" encoding="utf-8"?>
+<p:properties xmlns:p="http://schemas.microsoft.com/office/2006/metadata/properties" xmlns:xsi="http://www.w3.org/2001/XMLSchema-instance" xmlns:pc="http://schemas.microsoft.com/office/infopath/2007/PartnerControls">
+  <documentManagement>
+    <lcf76f155ced4ddcb4097134ff3c332f xmlns="6303f13c-72cc-47f0-aeed-d46f93b29717">
+      <Terms xmlns="http://schemas.microsoft.com/office/infopath/2007/PartnerControls"/>
+    </lcf76f155ced4ddcb4097134ff3c332f>
+    <TaxCatchAll xmlns="6fbcc8e4-81ed-40b2-9b21-aa98bc8e658d" xsi:nil="true"/>
+  </documentManagement>
+</p:properties>
+</file>
+
+<file path=customXml/item5.xml><?xml version="1.0" encoding="utf-8"?>
+<b:Sources xmlns:b="http://schemas.openxmlformats.org/officeDocument/2006/bibliography" xmlns="http://schemas.openxmlformats.org/officeDocument/2006/bibliography" SelectedStyle="\APASixthEditionOfficeOnline.xsl" StyleName="APA" Version="6"/>
+</file>
+
 <file path=customXml/itemProps1.xml><?xml version="1.0" encoding="utf-8"?>
 <ds:datastoreItem xmlns:ds="http://schemas.openxmlformats.org/officeDocument/2006/customXml" ds:itemID="{55AF091B-3C7A-41E3-B477-F2FDAA23CFDA}">
   <ds:schemaRefs>
@@ -10126,25 +10657,6 @@
 </file>
 
 <file path=customXml/itemProps3.xml><?xml version="1.0" encoding="utf-8"?>
-<ds:datastoreItem xmlns:ds="http://schemas.openxmlformats.org/officeDocument/2006/customXml" ds:itemID="{308B3A6F-517D-402D-9A9B-F8F60567BA9F}">
-  <ds:schemaRefs>
-    <ds:schemaRef ds:uri="http://schemas.openxmlformats.org/officeDocument/2006/bibliography"/>
-  </ds:schemaRefs>
-</ds:datastoreItem>
-</file>
-
-<file path=customXml/itemProps4.xml><?xml version="1.0" encoding="utf-8"?>
-<ds:datastoreItem xmlns:ds="http://schemas.openxmlformats.org/officeDocument/2006/customXml" ds:itemID="{9808B4E2-4289-4E8E-B008-90A7311206B5}">
-  <ds:schemaRefs>
-    <ds:schemaRef ds:uri="http://schemas.microsoft.com/office/2006/metadata/properties"/>
-    <ds:schemaRef ds:uri="http://schemas.microsoft.com/office/infopath/2007/PartnerControls"/>
-    <ds:schemaRef ds:uri="6303f13c-72cc-47f0-aeed-d46f93b29717"/>
-    <ds:schemaRef ds:uri="6fbcc8e4-81ed-40b2-9b21-aa98bc8e658d"/>
-  </ds:schemaRefs>
-</ds:datastoreItem>
-</file>
-
-<file path=customXml/itemProps5.xml><?xml version="1.0" encoding="utf-8"?>
 <ds:datastoreItem xmlns:ds="http://schemas.openxmlformats.org/officeDocument/2006/customXml" ds:itemID="{8D82154A-8925-4D70-8E81-8FCE0F18F3BE}">
   <ds:schemaRefs>
     <ds:schemaRef ds:uri="http://schemas.microsoft.com/office/2006/metadata/contentType"/>
@@ -10163,6 +10675,25 @@
 </ds:datastoreItem>
 </file>
 
+<file path=customXml/itemProps4.xml><?xml version="1.0" encoding="utf-8"?>
+<ds:datastoreItem xmlns:ds="http://schemas.openxmlformats.org/officeDocument/2006/customXml" ds:itemID="{9808B4E2-4289-4E8E-B008-90A7311206B5}">
+  <ds:schemaRefs>
+    <ds:schemaRef ds:uri="http://schemas.microsoft.com/office/2006/metadata/properties"/>
+    <ds:schemaRef ds:uri="http://schemas.microsoft.com/office/infopath/2007/PartnerControls"/>
+    <ds:schemaRef ds:uri="6303f13c-72cc-47f0-aeed-d46f93b29717"/>
+    <ds:schemaRef ds:uri="6fbcc8e4-81ed-40b2-9b21-aa98bc8e658d"/>
+  </ds:schemaRefs>
+</ds:datastoreItem>
+</file>
+
+<file path=customXml/itemProps5.xml><?xml version="1.0" encoding="utf-8"?>
+<ds:datastoreItem xmlns:ds="http://schemas.openxmlformats.org/officeDocument/2006/customXml" ds:itemID="{308B3A6F-517D-402D-9A9B-F8F60567BA9F}">
+  <ds:schemaRefs>
+    <ds:schemaRef ds:uri="http://schemas.openxmlformats.org/officeDocument/2006/bibliography"/>
+  </ds:schemaRefs>
+</ds:datastoreItem>
+</file>
+
 <file path=docMetadata/LabelInfo.xml><?xml version="1.0" encoding="utf-8"?>
 <clbl:labelList xmlns:clbl="http://schemas.microsoft.com/office/2020/mipLabelMetadata">
   <clbl:label id="{37c354b2-85b0-47f5-b222-07b48d774ee3}" enabled="0" method="" siteId="{37c354b2-85b0-47f5-b222-07b48d774ee3}" removed="1"/>

</xml_diff>